<commit_message>
mejora el procesamiento de las tablas
</commit_message>
<xml_diff>
--- a/test/test_prologoycomedia.docx
+++ b/test/test_prologoycomedia.docx
@@ -129,7 +129,35 @@
         <w:rPr>
           <w:lang w:val="es-ES"/>
         </w:rPr>
-        <w:t>hi rend="italic"</w:t>
+        <w:t xml:space="preserve">hi </w:t>
+      </w:r>
+      <w:proofErr w:type="spellStart"/>
+      <w:r>
+        <w:rPr>
+          <w:lang w:val="es-ES"/>
+        </w:rPr>
+        <w:t>rend</w:t>
+      </w:r>
+      <w:proofErr w:type="spellEnd"/>
+      <w:r>
+        <w:rPr>
+          <w:lang w:val="es-ES"/>
+        </w:rPr>
+        <w:t>="</w:t>
+      </w:r>
+      <w:proofErr w:type="spellStart"/>
+      <w:r>
+        <w:rPr>
+          <w:lang w:val="es-ES"/>
+        </w:rPr>
+        <w:t>italic</w:t>
+      </w:r>
+      <w:proofErr w:type="spellEnd"/>
+      <w:r>
+        <w:rPr>
+          <w:lang w:val="es-ES"/>
+        </w:rPr>
+        <w:t>"</w:t>
       </w:r>
       <w:r>
         <w:rPr>
@@ -323,7 +351,359 @@
     </w:p>
     <w:p>
       <w:pPr>
-        <w:pStyle w:val="Verso"/>
+        <w:rPr>
+          <w:lang w:val="es-ES"/>
+        </w:rPr>
+      </w:pPr>
+    </w:p>
+    <w:p>
+      <w:pPr>
+        <w:rPr>
+          <w:lang w:val="es-ES"/>
+        </w:rPr>
+      </w:pPr>
+      <w:r>
+        <w:rPr>
+          <w:lang w:val="es-ES"/>
+        </w:rPr>
+        <w:t>Además, puedes usar tablas en c</w:t>
+      </w:r>
+      <w:r>
+        <w:rPr>
+          <w:lang w:val="es-ES"/>
+        </w:rPr>
+        <w:t>ualquier apartado del prólogo:</w:t>
+      </w:r>
+    </w:p>
+    <w:tbl>
+      <w:tblPr>
+        <w:tblStyle w:val="Tablaconcuadrcula"/>
+        <w:tblW w:w="0" w:type="auto"/>
+        <w:tblLook w:val="04A0" w:firstRow="1" w:lastRow="0" w:firstColumn="1" w:lastColumn="0" w:noHBand="0" w:noVBand="1"/>
+      </w:tblPr>
+      <w:tblGrid>
+        <w:gridCol w:w="3209"/>
+        <w:gridCol w:w="3209"/>
+        <w:gridCol w:w="3210"/>
+      </w:tblGrid>
+      <w:tr>
+        <w:tc>
+          <w:tcPr>
+            <w:tcW w:w="3209" w:type="dxa"/>
+          </w:tcPr>
+          <w:p>
+            <w:proofErr w:type="spellStart"/>
+            <w:r>
+              <w:t>Número</w:t>
+            </w:r>
+            <w:proofErr w:type="spellEnd"/>
+            <w:r>
+              <w:t xml:space="preserve"> de verso</w:t>
+            </w:r>
+          </w:p>
+        </w:tc>
+        <w:tc>
+          <w:tcPr>
+            <w:tcW w:w="3209" w:type="dxa"/>
+          </w:tcPr>
+          <w:p>
+            <w:pPr>
+              <w:rPr>
+                <w:i/>
+                <w:iCs/>
+              </w:rPr>
+            </w:pPr>
+            <w:proofErr w:type="spellStart"/>
+            <w:r>
+              <w:rPr>
+                <w:i/>
+                <w:iCs/>
+                <w:lang w:val="pt-PT"/>
+              </w:rPr>
+              <w:t>Penn</w:t>
+            </w:r>
+            <w:proofErr w:type="spellEnd"/>
+            <w:r>
+              <w:rPr>
+                <w:i/>
+                <w:iCs/>
+                <w:lang w:val="pt-PT"/>
+              </w:rPr>
+              <w:t xml:space="preserve"> A2A5B1</w:t>
+            </w:r>
+          </w:p>
+        </w:tc>
+        <w:tc>
+          <w:tcPr>
+            <w:tcW w:w="3210" w:type="dxa"/>
+          </w:tcPr>
+          <w:p>
+            <w:pPr>
+              <w:rPr>
+                <w:i/>
+                <w:iCs/>
+              </w:rPr>
+            </w:pPr>
+            <w:r>
+              <w:rPr>
+                <w:i/>
+                <w:iCs/>
+                <w:lang w:val="pt-PT"/>
+              </w:rPr>
+              <w:t>A1A3A4</w:t>
+            </w:r>
+          </w:p>
+        </w:tc>
+      </w:tr>
+      <w:tr>
+        <w:tc>
+          <w:tcPr>
+            <w:tcW w:w="3209" w:type="dxa"/>
+          </w:tcPr>
+          <w:p>
+            <w:r>
+              <w:rPr>
+                <w:lang w:val="pt-PT"/>
+              </w:rPr>
+              <w:t>2993</w:t>
+            </w:r>
+          </w:p>
+        </w:tc>
+        <w:tc>
+          <w:tcPr>
+            <w:tcW w:w="3209" w:type="dxa"/>
+          </w:tcPr>
+          <w:p>
+            <w:r>
+              <w:rPr>
+                <w:lang w:val="pt-PT"/>
+              </w:rPr>
+              <w:t>porque</w:t>
+            </w:r>
+          </w:p>
+        </w:tc>
+        <w:tc>
+          <w:tcPr>
+            <w:tcW w:w="3210" w:type="dxa"/>
+          </w:tcPr>
+          <w:p>
+            <w:proofErr w:type="spellStart"/>
+            <w:r>
+              <w:rPr>
+                <w:lang w:val="pt-PT"/>
+              </w:rPr>
+              <w:t>orque</w:t>
+            </w:r>
+            <w:proofErr w:type="spellEnd"/>
+            <w:r>
+              <w:rPr>
+                <w:lang w:val="pt-PT"/>
+              </w:rPr>
+              <w:t xml:space="preserve"> [errata]</w:t>
+            </w:r>
+          </w:p>
+        </w:tc>
+      </w:tr>
+      <w:tr>
+        <w:tc>
+          <w:tcPr>
+            <w:tcW w:w="3209" w:type="dxa"/>
+          </w:tcPr>
+          <w:p>
+            <w:r>
+              <w:rPr>
+                <w:lang w:val="es-ES"/>
+              </w:rPr>
+              <w:t>2999</w:t>
+            </w:r>
+          </w:p>
+        </w:tc>
+        <w:tc>
+          <w:tcPr>
+            <w:tcW w:w="3209" w:type="dxa"/>
+          </w:tcPr>
+          <w:p>
+            <w:proofErr w:type="spellStart"/>
+            <w:r>
+              <w:rPr>
+                <w:lang w:val="es-ES"/>
+              </w:rPr>
+              <w:t>aua</w:t>
+            </w:r>
+            <w:proofErr w:type="spellEnd"/>
+            <w:r>
+              <w:rPr>
+                <w:lang w:val="es-ES"/>
+              </w:rPr>
+              <w:t xml:space="preserve"> [errata]</w:t>
+            </w:r>
+          </w:p>
+        </w:tc>
+        <w:tc>
+          <w:tcPr>
+            <w:tcW w:w="3210" w:type="dxa"/>
+          </w:tcPr>
+          <w:p>
+            <w:proofErr w:type="spellStart"/>
+            <w:r>
+              <w:rPr>
+                <w:lang w:val="es-ES"/>
+              </w:rPr>
+              <w:t>auia</w:t>
+            </w:r>
+            <w:proofErr w:type="spellEnd"/>
+          </w:p>
+        </w:tc>
+      </w:tr>
+      <w:tr>
+        <w:tc>
+          <w:tcPr>
+            <w:tcW w:w="3209" w:type="dxa"/>
+          </w:tcPr>
+          <w:p>
+            <w:r>
+              <w:rPr>
+                <w:lang w:val="es-ES"/>
+              </w:rPr>
+              <w:t>3010</w:t>
+            </w:r>
+          </w:p>
+        </w:tc>
+        <w:tc>
+          <w:tcPr>
+            <w:tcW w:w="3209" w:type="dxa"/>
+          </w:tcPr>
+          <w:p>
+            <w:proofErr w:type="spellStart"/>
+            <w:r>
+              <w:rPr>
+                <w:lang w:val="es-ES"/>
+              </w:rPr>
+              <w:t>om</w:t>
+            </w:r>
+            <w:proofErr w:type="spellEnd"/>
+            <w:r>
+              <w:rPr>
+                <w:lang w:val="es-ES"/>
+              </w:rPr>
+              <w:t xml:space="preserve"> [errata]</w:t>
+            </w:r>
+          </w:p>
+        </w:tc>
+        <w:tc>
+          <w:tcPr>
+            <w:tcW w:w="3210" w:type="dxa"/>
+          </w:tcPr>
+          <w:p>
+            <w:r>
+              <w:rPr>
+                <w:lang w:val="es-ES"/>
+              </w:rPr>
+              <w:t>hecho</w:t>
+            </w:r>
+          </w:p>
+        </w:tc>
+      </w:tr>
+      <w:tr>
+        <w:tc>
+          <w:tcPr>
+            <w:tcW w:w="3209" w:type="dxa"/>
+          </w:tcPr>
+          <w:p>
+            <w:r>
+              <w:rPr>
+                <w:lang w:val="es-ES"/>
+              </w:rPr>
+              <w:t>3019</w:t>
+            </w:r>
+          </w:p>
+        </w:tc>
+        <w:tc>
+          <w:tcPr>
+            <w:tcW w:w="3209" w:type="dxa"/>
+          </w:tcPr>
+          <w:p>
+            <w:proofErr w:type="spellStart"/>
+            <w:r>
+              <w:rPr>
+                <w:lang w:val="es-ES"/>
+              </w:rPr>
+              <w:t>Esteuan</w:t>
+            </w:r>
+            <w:proofErr w:type="spellEnd"/>
+            <w:r>
+              <w:rPr>
+                <w:lang w:val="es-ES"/>
+              </w:rPr>
+              <w:t xml:space="preserve"> es</w:t>
+            </w:r>
+          </w:p>
+        </w:tc>
+        <w:tc>
+          <w:tcPr>
+            <w:tcW w:w="3210" w:type="dxa"/>
+          </w:tcPr>
+          <w:p>
+            <w:proofErr w:type="spellStart"/>
+            <w:r>
+              <w:rPr>
+                <w:lang w:val="es-ES"/>
+              </w:rPr>
+              <w:t>Esteuañez</w:t>
+            </w:r>
+            <w:proofErr w:type="spellEnd"/>
+          </w:p>
+        </w:tc>
+      </w:tr>
+      <w:tr>
+        <w:tc>
+          <w:tcPr>
+            <w:tcW w:w="3209" w:type="dxa"/>
+          </w:tcPr>
+          <w:p>
+            <w:r>
+              <w:rPr>
+                <w:lang w:val="es-ES"/>
+              </w:rPr>
+              <w:t>3024</w:t>
+            </w:r>
+          </w:p>
+        </w:tc>
+        <w:tc>
+          <w:tcPr>
+            <w:tcW w:w="3209" w:type="dxa"/>
+          </w:tcPr>
+          <w:p>
+            <w:r>
+              <w:rPr>
+                <w:lang w:val="es-ES"/>
+              </w:rPr>
+              <w:t>hizo</w:t>
+            </w:r>
+          </w:p>
+        </w:tc>
+        <w:tc>
+          <w:tcPr>
+            <w:tcW w:w="3210" w:type="dxa"/>
+          </w:tcPr>
+          <w:p>
+            <w:proofErr w:type="spellStart"/>
+            <w:r>
+              <w:rPr>
+                <w:lang w:val="es-ES"/>
+              </w:rPr>
+              <w:t>huuo</w:t>
+            </w:r>
+            <w:proofErr w:type="spellEnd"/>
+          </w:p>
+        </w:tc>
+      </w:tr>
+    </w:tbl>
+    <w:p>
+      <w:pPr>
+        <w:rPr>
+          <w:lang w:val="es-ES"/>
+        </w:rPr>
       </w:pPr>
     </w:p>
     <w:p>
@@ -444,6 +824,7 @@
                 <w:lang w:eastAsia="it-IT"/>
               </w:rPr>
             </w:pPr>
+            <w:proofErr w:type="spellStart"/>
             <w:r>
               <w:rPr>
                 <w:rFonts w:ascii="Arial" w:eastAsia="Times New Roman" w:hAnsi="Arial" w:cs="Arial"/>
@@ -455,6 +836,7 @@
               </w:rPr>
               <w:t>Estrofa</w:t>
             </w:r>
+            <w:proofErr w:type="spellEnd"/>
           </w:p>
         </w:tc>
         <w:tc>
@@ -493,12 +875,21 @@
             <w:tcW w:w="2841" w:type="dxa"/>
           </w:tcPr>
           <w:p>
+            <w:proofErr w:type="spellStart"/>
             <w:r>
               <w:rPr>
                 <w:b/>
                 <w:i/>
               </w:rPr>
-              <w:t>Acto primero</w:t>
+              <w:t>Acto</w:t>
+            </w:r>
+            <w:proofErr w:type="spellEnd"/>
+            <w:r>
+              <w:rPr>
+                <w:b/>
+                <w:i/>
+              </w:rPr>
+              <w:t xml:space="preserve"> primero</w:t>
             </w:r>
           </w:p>
         </w:tc>
@@ -536,9 +927,11 @@
             <w:tcW w:w="2841" w:type="dxa"/>
           </w:tcPr>
           <w:p>
+            <w:proofErr w:type="spellStart"/>
             <w:r>
               <w:t>redondillas</w:t>
             </w:r>
+            <w:proofErr w:type="spellEnd"/>
           </w:p>
         </w:tc>
         <w:tc>
@@ -572,8 +965,21 @@
           </w:tcPr>
           <w:p>
             <w:r>
-              <w:t>romance en – eo</w:t>
-            </w:r>
+              <w:t xml:space="preserve">romance </w:t>
+            </w:r>
+            <w:proofErr w:type="spellStart"/>
+            <w:r>
+              <w:t>en</w:t>
+            </w:r>
+            <w:proofErr w:type="spellEnd"/>
+            <w:r>
+              <w:t xml:space="preserve"> – </w:t>
+            </w:r>
+            <w:proofErr w:type="spellStart"/>
+            <w:r>
+              <w:t>eo</w:t>
+            </w:r>
+            <w:proofErr w:type="spellEnd"/>
           </w:p>
         </w:tc>
         <w:tc>
@@ -603,9 +1009,19 @@
             <w:tcW w:w="2841" w:type="dxa"/>
           </w:tcPr>
           <w:p>
-            <w:r>
-              <w:t>endecasílabos sueltos</w:t>
-            </w:r>
+            <w:proofErr w:type="spellStart"/>
+            <w:r>
+              <w:t>endecasílabos</w:t>
+            </w:r>
+            <w:proofErr w:type="spellEnd"/>
+            <w:r>
+              <w:t xml:space="preserve"> </w:t>
+            </w:r>
+            <w:proofErr w:type="spellStart"/>
+            <w:r>
+              <w:t>sueltos</w:t>
+            </w:r>
+            <w:proofErr w:type="spellEnd"/>
           </w:p>
         </w:tc>
         <w:tc>
@@ -635,9 +1051,11 @@
             <w:tcW w:w="2841" w:type="dxa"/>
           </w:tcPr>
           <w:p>
+            <w:proofErr w:type="spellStart"/>
             <w:r>
               <w:t>soneto</w:t>
             </w:r>
+            <w:proofErr w:type="spellEnd"/>
           </w:p>
         </w:tc>
         <w:tc>
@@ -730,18 +1148,27 @@
             <w:tcW w:w="2841" w:type="dxa"/>
           </w:tcPr>
           <w:p>
+            <w:proofErr w:type="spellStart"/>
             <w:r>
               <w:rPr>
                 <w:b/>
                 <w:i/>
               </w:rPr>
-              <w:t xml:space="preserve">Acto </w:t>
-            </w:r>
+              <w:t>Acto</w:t>
+            </w:r>
+            <w:proofErr w:type="spellEnd"/>
             <w:r>
               <w:rPr>
                 <w:b/>
                 <w:i/>
               </w:rPr>
+              <w:t xml:space="preserve"> </w:t>
+            </w:r>
+            <w:r>
+              <w:rPr>
+                <w:b/>
+                <w:i/>
+              </w:rPr>
               <w:t>Segundo</w:t>
             </w:r>
           </w:p>
@@ -775,9 +1202,11 @@
             <w:tcW w:w="2841" w:type="dxa"/>
           </w:tcPr>
           <w:p>
+            <w:proofErr w:type="spellStart"/>
             <w:r>
               <w:t>quintillas</w:t>
             </w:r>
+            <w:proofErr w:type="spellEnd"/>
           </w:p>
         </w:tc>
         <w:tc>
@@ -807,9 +1236,11 @@
             <w:tcW w:w="2841" w:type="dxa"/>
           </w:tcPr>
           <w:p>
+            <w:proofErr w:type="spellStart"/>
             <w:r>
               <w:t>Redondillas</w:t>
             </w:r>
+            <w:proofErr w:type="spellEnd"/>
           </w:p>
         </w:tc>
         <w:tc>
@@ -934,18 +1365,27 @@
             <w:tcW w:w="2841" w:type="dxa"/>
           </w:tcPr>
           <w:p>
+            <w:proofErr w:type="spellStart"/>
             <w:r>
               <w:rPr>
                 <w:b/>
                 <w:i/>
               </w:rPr>
-              <w:t xml:space="preserve">Acto </w:t>
-            </w:r>
+              <w:t>Acto</w:t>
+            </w:r>
+            <w:proofErr w:type="spellEnd"/>
             <w:r>
               <w:rPr>
                 <w:b/>
                 <w:i/>
               </w:rPr>
+              <w:t xml:space="preserve"> </w:t>
+            </w:r>
+            <w:r>
+              <w:rPr>
+                <w:b/>
+                <w:i/>
+              </w:rPr>
               <w:t>Tercero</w:t>
             </w:r>
           </w:p>
@@ -970,6 +1410,7 @@
           </w:tcPr>
           <w:p>
             <w:r>
+              <w:lastRenderedPageBreak/>
               <w:t>123-146</w:t>
             </w:r>
           </w:p>
@@ -979,9 +1420,11 @@
             <w:tcW w:w="2841" w:type="dxa"/>
           </w:tcPr>
           <w:p>
+            <w:proofErr w:type="spellStart"/>
             <w:r>
               <w:t>redondillas</w:t>
             </w:r>
+            <w:proofErr w:type="spellEnd"/>
           </w:p>
         </w:tc>
         <w:tc>
@@ -1011,8 +1454,13 @@
             <w:tcW w:w="2841" w:type="dxa"/>
           </w:tcPr>
           <w:p>
-            <w:r>
-              <w:t>octavas reales</w:t>
+            <w:proofErr w:type="spellStart"/>
+            <w:r>
+              <w:t>octavas</w:t>
+            </w:r>
+            <w:proofErr w:type="spellEnd"/>
+            <w:r>
+              <w:t xml:space="preserve"> reales</w:t>
             </w:r>
           </w:p>
         </w:tc>
@@ -1049,9 +1497,19 @@
             <w:tcW w:w="2841" w:type="dxa"/>
           </w:tcPr>
           <w:p>
-            <w:r>
-              <w:t>tercetos encadenados</w:t>
-            </w:r>
+            <w:proofErr w:type="spellStart"/>
+            <w:r>
+              <w:t>tercetos</w:t>
+            </w:r>
+            <w:proofErr w:type="spellEnd"/>
+            <w:r>
+              <w:t xml:space="preserve"> </w:t>
+            </w:r>
+            <w:proofErr w:type="spellStart"/>
+            <w:r>
+              <w:t>encadenados</w:t>
+            </w:r>
+            <w:proofErr w:type="spellEnd"/>
           </w:p>
         </w:tc>
         <w:tc>
@@ -1150,6 +1608,7 @@
                 <w:i/>
               </w:rPr>
             </w:pPr>
+            <w:proofErr w:type="spellStart"/>
             <w:r>
               <w:rPr>
                 <w:b/>
@@ -1157,6 +1616,7 @@
               </w:rPr>
               <w:t>Resumen</w:t>
             </w:r>
+            <w:proofErr w:type="spellEnd"/>
           </w:p>
         </w:tc>
         <w:tc>
@@ -1206,12 +1666,14 @@
             <w:tcW w:w="2841" w:type="dxa"/>
           </w:tcPr>
           <w:p>
+            <w:proofErr w:type="spellStart"/>
             <w:r>
               <w:t>r</w:t>
             </w:r>
             <w:r>
               <w:t>edondillas</w:t>
             </w:r>
+            <w:proofErr w:type="spellEnd"/>
           </w:p>
         </w:tc>
         <w:tc>
@@ -1241,9 +1703,11 @@
             <w:tcW w:w="2841" w:type="dxa"/>
           </w:tcPr>
           <w:p>
+            <w:proofErr w:type="spellStart"/>
             <w:r>
               <w:t>quintillas</w:t>
             </w:r>
+            <w:proofErr w:type="spellEnd"/>
           </w:p>
         </w:tc>
         <w:tc>
@@ -1305,10 +1769,19 @@
             <w:tcW w:w="2841" w:type="dxa"/>
           </w:tcPr>
           <w:p>
-            <w:r>
-              <w:lastRenderedPageBreak/>
-              <w:t>endecasílabos sueltos</w:t>
-            </w:r>
+            <w:proofErr w:type="spellStart"/>
+            <w:r>
+              <w:t>endecasílabos</w:t>
+            </w:r>
+            <w:proofErr w:type="spellEnd"/>
+            <w:r>
+              <w:t xml:space="preserve"> </w:t>
+            </w:r>
+            <w:proofErr w:type="spellStart"/>
+            <w:r>
+              <w:t>sueltos</w:t>
+            </w:r>
+            <w:proofErr w:type="spellEnd"/>
           </w:p>
         </w:tc>
         <w:tc>
@@ -1338,8 +1811,13 @@
             <w:tcW w:w="2841" w:type="dxa"/>
           </w:tcPr>
           <w:p>
-            <w:r>
-              <w:t>octavas reales</w:t>
+            <w:proofErr w:type="spellStart"/>
+            <w:r>
+              <w:t>octavas</w:t>
+            </w:r>
+            <w:proofErr w:type="spellEnd"/>
+            <w:r>
+              <w:t xml:space="preserve"> reales</w:t>
             </w:r>
           </w:p>
         </w:tc>
@@ -1370,9 +1848,19 @@
             <w:tcW w:w="2841" w:type="dxa"/>
           </w:tcPr>
           <w:p>
-            <w:r>
-              <w:t>tercetos encadenados</w:t>
-            </w:r>
+            <w:proofErr w:type="spellStart"/>
+            <w:r>
+              <w:t>tercetos</w:t>
+            </w:r>
+            <w:proofErr w:type="spellEnd"/>
+            <w:r>
+              <w:t xml:space="preserve"> </w:t>
+            </w:r>
+            <w:proofErr w:type="spellStart"/>
+            <w:r>
+              <w:t>encadenados</w:t>
+            </w:r>
+            <w:proofErr w:type="spellEnd"/>
           </w:p>
         </w:tc>
         <w:tc>
@@ -1434,9 +1922,11 @@
             <w:tcW w:w="2841" w:type="dxa"/>
           </w:tcPr>
           <w:p>
+            <w:proofErr w:type="spellStart"/>
             <w:r>
               <w:t>soneto</w:t>
             </w:r>
+            <w:proofErr w:type="spellEnd"/>
           </w:p>
         </w:tc>
         <w:tc>
@@ -1721,10 +2211,34 @@
         <w:t xml:space="preserve"> explicativas o entradas de aparato crítico</w:t>
       </w:r>
       <w:r>
-        <w:t>, ahora no van como notas al pie, sino que están en un archivo aparte. Dado que no se pueden usar números como en los versos, para las notas en las partes sin numerar (títulos, dedicatoria, dramatis personae, acotaciones, etc.), se usa @ delante la @palabra a la que afecta, o última palabra de la frase, de forma que se identifique después dónde va la llamada a la nota.</w:t>
-      </w:r>
-      <w:r>
-        <w:t xml:space="preserve"> Si se trata de una entrada de aparato crítico, igual pero con %. Si una @%palabra lleva una nota y también una entrada de aparato, se usan ambos símbolos en ese orden.</w:t>
+        <w:t xml:space="preserve">, ahora no van como notas al pie, sino que están en un archivo aparte. Dado que no se pueden usar números como en los versos, para las notas en las partes sin numerar (títulos, dedicatoria, </w:t>
+      </w:r>
+      <w:proofErr w:type="spellStart"/>
+      <w:r>
+        <w:t>dramatis</w:t>
+      </w:r>
+      <w:proofErr w:type="spellEnd"/>
+      <w:r>
+        <w:t xml:space="preserve"> </w:t>
+      </w:r>
+      <w:proofErr w:type="spellStart"/>
+      <w:r>
+        <w:t>personae</w:t>
+      </w:r>
+      <w:proofErr w:type="spellEnd"/>
+      <w:r>
+        <w:t>, acotaciones, etc.), se usa @ delante la @palabra a la que afecta, o última palabra de la frase, de forma que se identifique después dónde va la llamada a la nota.</w:t>
+      </w:r>
+      <w:r>
+        <w:t xml:space="preserve"> Si se trata de una entrada de aparato crítico, </w:t>
+      </w:r>
+      <w:proofErr w:type="gramStart"/>
+      <w:r>
+        <w:t>igual</w:t>
+      </w:r>
+      <w:proofErr w:type="gramEnd"/>
+      <w:r>
+        <w:t xml:space="preserve"> pero con %. Si una @%palabra lleva una nota y también una entrada de aparato, se usan ambos símbolos en ese orden.</w:t>
       </w:r>
     </w:p>
     <w:p>
@@ -1797,6 +2311,7 @@
         <w:pStyle w:val="Dramatislista"/>
       </w:pPr>
       <w:r>
+        <w:lastRenderedPageBreak/>
         <w:t>%</w:t>
       </w:r>
       <w:r>
@@ -2240,6 +2755,7 @@
         <w:pStyle w:val="Partidofinal"/>
       </w:pPr>
       <w:r>
+        <w:lastRenderedPageBreak/>
         <w:t xml:space="preserve">con “inicial”,  </w:t>
       </w:r>
     </w:p>
@@ -2305,8 +2821,13 @@
       <w:pPr>
         <w:pStyle w:val="Partidofinal"/>
       </w:pPr>
-      <w:r>
-        <w:t xml:space="preserve">si hay unión,  </w:t>
+      <w:proofErr w:type="spellStart"/>
+      <w:r>
+        <w:t>si</w:t>
+      </w:r>
+      <w:proofErr w:type="spellEnd"/>
+      <w:r>
+        <w:t xml:space="preserve"> hay unión,  </w:t>
       </w:r>
     </w:p>
     <w:p>
@@ -2314,7 +2835,6 @@
         <w:pStyle w:val="Personaje"/>
       </w:pPr>
       <w:r>
-        <w:lastRenderedPageBreak/>
         <w:t>P</w:t>
       </w:r>
       <w:r>
@@ -2623,6 +3143,7 @@
         </w:rPr>
       </w:pPr>
       <w:r>
+        <w:lastRenderedPageBreak/>
         <w:t>Así termina el ejemplo,</w:t>
       </w:r>
     </w:p>
@@ -3442,7 +3963,6 @@
   <w:style w:type="character" w:default="1" w:styleId="Fuentedeprrafopredeter">
     <w:name w:val="Default Paragraph Font"/>
     <w:uiPriority w:val="1"/>
-    <w:semiHidden/>
     <w:unhideWhenUsed/>
   </w:style>
   <w:style w:type="table" w:default="1" w:styleId="Tablanormal">

</xml_diff>

<commit_message>
añadido soporte para: - versos partidos en prologo - titulos y dramatis por acto
</commit_message>
<xml_diff>
--- a/test/test_prologoycomedia.docx
+++ b/test/test_prologoycomedia.docx
@@ -346,7 +346,18 @@
         <w:pStyle w:val="Verso"/>
       </w:pPr>
       <w:r>
-        <w:t>que es verso y no prosa aquí.</w:t>
+        <w:rPr>
+          <w:rStyle w:val="PartidoinicialCar"/>
+        </w:rPr>
+        <w:t>que es verso</w:t>
+      </w:r>
+    </w:p>
+    <w:p>
+      <w:pPr>
+        <w:pStyle w:val="Partidofinal"/>
+      </w:pPr>
+      <w:r>
+        <w:t>y no prosa aquí.</w:t>
       </w:r>
     </w:p>
     <w:p>
@@ -1311,6 +1322,7 @@
                 <w:iCs/>
                 <w:lang w:eastAsia="it-IT"/>
               </w:rPr>
+              <w:lastRenderedPageBreak/>
               <w:t>Total</w:t>
             </w:r>
           </w:p>
@@ -1410,7 +1422,6 @@
           </w:tcPr>
           <w:p>
             <w:r>
-              <w:lastRenderedPageBreak/>
               <w:t>123-146</w:t>
             </w:r>
           </w:p>
@@ -2292,6 +2303,7 @@
         <w:pStyle w:val="Dramatislista"/>
       </w:pPr>
       <w:r>
+        <w:lastRenderedPageBreak/>
         <w:t>PERSONAJE2</w:t>
       </w:r>
     </w:p>
@@ -2311,7 +2323,6 @@
         <w:pStyle w:val="Dramatislista"/>
       </w:pPr>
       <w:r>
-        <w:lastRenderedPageBreak/>
         <w:t>%</w:t>
       </w:r>
       <w:r>
@@ -2744,6 +2755,7 @@
         <w:pStyle w:val="Personaje"/>
       </w:pPr>
       <w:r>
+        <w:lastRenderedPageBreak/>
         <w:t>P</w:t>
       </w:r>
       <w:r>
@@ -2755,7 +2767,6 @@
         <w:pStyle w:val="Partidofinal"/>
       </w:pPr>
       <w:r>
-        <w:lastRenderedPageBreak/>
         <w:t xml:space="preserve">con “inicial”,  </w:t>
       </w:r>
     </w:p>
@@ -3126,6 +3137,7 @@
         <w:pStyle w:val="Personaje"/>
       </w:pPr>
       <w:r>
+        <w:lastRenderedPageBreak/>
         <w:t>P</w:t>
       </w:r>
       <w:r>
@@ -3143,7 +3155,6 @@
         </w:rPr>
       </w:pPr>
       <w:r>
-        <w:lastRenderedPageBreak/>
         <w:t>Así termina el ejemplo,</w:t>
       </w:r>
     </w:p>
@@ -3963,6 +3974,7 @@
   <w:style w:type="character" w:default="1" w:styleId="Fuentedeprrafopredeter">
     <w:name w:val="Default Paragraph Font"/>
     <w:uiPriority w:val="1"/>
+    <w:semiHidden/>
     <w:unhideWhenUsed/>
   </w:style>
   <w:style w:type="table" w:default="1" w:styleId="Tablanormal">

</xml_diff>

<commit_message>
añadido soporte de acotaciones en el prólogo
</commit_message>
<xml_diff>
--- a/test/test_prologoycomedia.docx
+++ b/test/test_prologoycomedia.docx
@@ -129,35 +129,7 @@
         <w:rPr>
           <w:lang w:val="es-ES"/>
         </w:rPr>
-        <w:t xml:space="preserve">hi </w:t>
-      </w:r>
-      <w:proofErr w:type="spellStart"/>
-      <w:r>
-        <w:rPr>
-          <w:lang w:val="es-ES"/>
-        </w:rPr>
-        <w:t>rend</w:t>
-      </w:r>
-      <w:proofErr w:type="spellEnd"/>
-      <w:r>
-        <w:rPr>
-          <w:lang w:val="es-ES"/>
-        </w:rPr>
-        <w:t>="</w:t>
-      </w:r>
-      <w:proofErr w:type="spellStart"/>
-      <w:r>
-        <w:rPr>
-          <w:lang w:val="es-ES"/>
-        </w:rPr>
-        <w:t>italic</w:t>
-      </w:r>
-      <w:proofErr w:type="spellEnd"/>
-      <w:r>
-        <w:rPr>
-          <w:lang w:val="es-ES"/>
-        </w:rPr>
-        <w:t>"</w:t>
+        <w:t>hi rend="italic"</w:t>
       </w:r>
       <w:r>
         <w:rPr>
@@ -358,6 +330,20 @@
       </w:pPr>
       <w:r>
         <w:t>y no prosa aquí.</w:t>
+      </w:r>
+    </w:p>
+    <w:p>
+      <w:pPr>
+        <w:pStyle w:val="Acot"/>
+        <w:rPr>
+          <w:lang w:val="es-ES"/>
+        </w:rPr>
+      </w:pPr>
+      <w:r>
+        <w:rPr>
+          <w:lang w:val="es-ES"/>
+        </w:rPr>
+        <w:t>Acotación en el prólogo</w:t>
       </w:r>
     </w:p>
     <w:p>
@@ -403,13 +389,8 @@
             <w:tcW w:w="3209" w:type="dxa"/>
           </w:tcPr>
           <w:p>
-            <w:proofErr w:type="spellStart"/>
-            <w:r>
-              <w:t>Número</w:t>
-            </w:r>
-            <w:proofErr w:type="spellEnd"/>
-            <w:r>
-              <w:t xml:space="preserve"> de verso</w:t>
+            <w:r>
+              <w:t>Número de verso</w:t>
             </w:r>
           </w:p>
         </w:tc>
@@ -424,43 +405,33 @@
                 <w:iCs/>
               </w:rPr>
             </w:pPr>
-            <w:proofErr w:type="spellStart"/>
             <w:r>
               <w:rPr>
                 <w:i/>
                 <w:iCs/>
                 <w:lang w:val="pt-PT"/>
               </w:rPr>
-              <w:t>Penn</w:t>
-            </w:r>
-            <w:proofErr w:type="spellEnd"/>
+              <w:t>Penn A2A5B1</w:t>
+            </w:r>
+          </w:p>
+        </w:tc>
+        <w:tc>
+          <w:tcPr>
+            <w:tcW w:w="3210" w:type="dxa"/>
+          </w:tcPr>
+          <w:p>
+            <w:pPr>
+              <w:rPr>
+                <w:i/>
+                <w:iCs/>
+              </w:rPr>
+            </w:pPr>
             <w:r>
               <w:rPr>
                 <w:i/>
                 <w:iCs/>
                 <w:lang w:val="pt-PT"/>
               </w:rPr>
-              <w:t xml:space="preserve"> A2A5B1</w:t>
-            </w:r>
-          </w:p>
-        </w:tc>
-        <w:tc>
-          <w:tcPr>
-            <w:tcW w:w="3210" w:type="dxa"/>
-          </w:tcPr>
-          <w:p>
-            <w:pPr>
-              <w:rPr>
-                <w:i/>
-                <w:iCs/>
-              </w:rPr>
-            </w:pPr>
-            <w:r>
-              <w:rPr>
-                <w:i/>
-                <w:iCs/>
-                <w:lang w:val="pt-PT"/>
-              </w:rPr>
               <w:t>A1A3A4</w:t>
             </w:r>
           </w:p>
@@ -498,19 +469,11 @@
             <w:tcW w:w="3210" w:type="dxa"/>
           </w:tcPr>
           <w:p>
-            <w:proofErr w:type="spellStart"/>
             <w:r>
               <w:rPr>
                 <w:lang w:val="pt-PT"/>
               </w:rPr>
-              <w:t>orque</w:t>
-            </w:r>
-            <w:proofErr w:type="spellEnd"/>
-            <w:r>
-              <w:rPr>
-                <w:lang w:val="pt-PT"/>
-              </w:rPr>
-              <w:t xml:space="preserve"> [errata]</w:t>
+              <w:t>orque [errata]</w:t>
             </w:r>
           </w:p>
         </w:tc>
@@ -534,35 +497,25 @@
             <w:tcW w:w="3209" w:type="dxa"/>
           </w:tcPr>
           <w:p>
-            <w:proofErr w:type="spellStart"/>
             <w:r>
               <w:rPr>
                 <w:lang w:val="es-ES"/>
               </w:rPr>
-              <w:t>aua</w:t>
-            </w:r>
-            <w:proofErr w:type="spellEnd"/>
+              <w:t>aua [errata]</w:t>
+            </w:r>
+          </w:p>
+        </w:tc>
+        <w:tc>
+          <w:tcPr>
+            <w:tcW w:w="3210" w:type="dxa"/>
+          </w:tcPr>
+          <w:p>
             <w:r>
               <w:rPr>
                 <w:lang w:val="es-ES"/>
               </w:rPr>
-              <w:t xml:space="preserve"> [errata]</w:t>
-            </w:r>
-          </w:p>
-        </w:tc>
-        <w:tc>
-          <w:tcPr>
-            <w:tcW w:w="3210" w:type="dxa"/>
-          </w:tcPr>
-          <w:p>
-            <w:proofErr w:type="spellStart"/>
-            <w:r>
-              <w:rPr>
-                <w:lang w:val="es-ES"/>
-              </w:rPr>
               <w:t>auia</w:t>
             </w:r>
-            <w:proofErr w:type="spellEnd"/>
           </w:p>
         </w:tc>
       </w:tr>
@@ -585,19 +538,11 @@
             <w:tcW w:w="3209" w:type="dxa"/>
           </w:tcPr>
           <w:p>
-            <w:proofErr w:type="spellStart"/>
             <w:r>
               <w:rPr>
                 <w:lang w:val="es-ES"/>
               </w:rPr>
-              <w:t>om</w:t>
-            </w:r>
-            <w:proofErr w:type="spellEnd"/>
-            <w:r>
-              <w:rPr>
-                <w:lang w:val="es-ES"/>
-              </w:rPr>
-              <w:t xml:space="preserve"> [errata]</w:t>
+              <w:t>om [errata]</w:t>
             </w:r>
           </w:p>
         </w:tc>
@@ -634,35 +579,25 @@
             <w:tcW w:w="3209" w:type="dxa"/>
           </w:tcPr>
           <w:p>
-            <w:proofErr w:type="spellStart"/>
             <w:r>
               <w:rPr>
                 <w:lang w:val="es-ES"/>
               </w:rPr>
-              <w:t>Esteuan</w:t>
-            </w:r>
-            <w:proofErr w:type="spellEnd"/>
+              <w:t>Esteuan es</w:t>
+            </w:r>
+          </w:p>
+        </w:tc>
+        <w:tc>
+          <w:tcPr>
+            <w:tcW w:w="3210" w:type="dxa"/>
+          </w:tcPr>
+          <w:p>
             <w:r>
               <w:rPr>
                 <w:lang w:val="es-ES"/>
               </w:rPr>
-              <w:t xml:space="preserve"> es</w:t>
-            </w:r>
-          </w:p>
-        </w:tc>
-        <w:tc>
-          <w:tcPr>
-            <w:tcW w:w="3210" w:type="dxa"/>
-          </w:tcPr>
-          <w:p>
-            <w:proofErr w:type="spellStart"/>
-            <w:r>
-              <w:rPr>
-                <w:lang w:val="es-ES"/>
-              </w:rPr>
               <w:t>Esteuañez</w:t>
             </w:r>
-            <w:proofErr w:type="spellEnd"/>
           </w:p>
         </w:tc>
       </w:tr>
@@ -698,14 +633,12 @@
             <w:tcW w:w="3210" w:type="dxa"/>
           </w:tcPr>
           <w:p>
-            <w:proofErr w:type="spellStart"/>
             <w:r>
               <w:rPr>
                 <w:lang w:val="es-ES"/>
               </w:rPr>
               <w:t>huuo</w:t>
             </w:r>
-            <w:proofErr w:type="spellEnd"/>
           </w:p>
         </w:tc>
       </w:tr>
@@ -835,7 +768,6 @@
                 <w:lang w:eastAsia="it-IT"/>
               </w:rPr>
             </w:pPr>
-            <w:proofErr w:type="spellStart"/>
             <w:r>
               <w:rPr>
                 <w:rFonts w:ascii="Arial" w:eastAsia="Times New Roman" w:hAnsi="Arial" w:cs="Arial"/>
@@ -847,7 +779,6 @@
               </w:rPr>
               <w:t>Estrofa</w:t>
             </w:r>
-            <w:proofErr w:type="spellEnd"/>
           </w:p>
         </w:tc>
         <w:tc>
@@ -886,21 +817,12 @@
             <w:tcW w:w="2841" w:type="dxa"/>
           </w:tcPr>
           <w:p>
-            <w:proofErr w:type="spellStart"/>
             <w:r>
               <w:rPr>
                 <w:b/>
                 <w:i/>
               </w:rPr>
-              <w:t>Acto</w:t>
-            </w:r>
-            <w:proofErr w:type="spellEnd"/>
-            <w:r>
-              <w:rPr>
-                <w:b/>
-                <w:i/>
-              </w:rPr>
-              <w:t xml:space="preserve"> primero</w:t>
+              <w:t>Acto primero</w:t>
             </w:r>
           </w:p>
         </w:tc>
@@ -938,11 +860,9 @@
             <w:tcW w:w="2841" w:type="dxa"/>
           </w:tcPr>
           <w:p>
-            <w:proofErr w:type="spellStart"/>
             <w:r>
               <w:t>redondillas</w:t>
             </w:r>
-            <w:proofErr w:type="spellEnd"/>
           </w:p>
         </w:tc>
         <w:tc>
@@ -976,21 +896,8 @@
           </w:tcPr>
           <w:p>
             <w:r>
-              <w:t xml:space="preserve">romance </w:t>
-            </w:r>
-            <w:proofErr w:type="spellStart"/>
-            <w:r>
-              <w:t>en</w:t>
-            </w:r>
-            <w:proofErr w:type="spellEnd"/>
-            <w:r>
-              <w:t xml:space="preserve"> – </w:t>
-            </w:r>
-            <w:proofErr w:type="spellStart"/>
-            <w:r>
-              <w:t>eo</w:t>
-            </w:r>
-            <w:proofErr w:type="spellEnd"/>
+              <w:t>romance en – eo</w:t>
+            </w:r>
           </w:p>
         </w:tc>
         <w:tc>
@@ -1020,19 +927,9 @@
             <w:tcW w:w="2841" w:type="dxa"/>
           </w:tcPr>
           <w:p>
-            <w:proofErr w:type="spellStart"/>
-            <w:r>
-              <w:t>endecasílabos</w:t>
-            </w:r>
-            <w:proofErr w:type="spellEnd"/>
-            <w:r>
-              <w:t xml:space="preserve"> </w:t>
-            </w:r>
-            <w:proofErr w:type="spellStart"/>
-            <w:r>
-              <w:t>sueltos</w:t>
-            </w:r>
-            <w:proofErr w:type="spellEnd"/>
+            <w:r>
+              <w:t>endecasílabos sueltos</w:t>
+            </w:r>
           </w:p>
         </w:tc>
         <w:tc>
@@ -1062,11 +959,9 @@
             <w:tcW w:w="2841" w:type="dxa"/>
           </w:tcPr>
           <w:p>
-            <w:proofErr w:type="spellStart"/>
             <w:r>
               <w:t>soneto</w:t>
             </w:r>
-            <w:proofErr w:type="spellEnd"/>
           </w:p>
         </w:tc>
         <w:tc>
@@ -1159,27 +1054,18 @@
             <w:tcW w:w="2841" w:type="dxa"/>
           </w:tcPr>
           <w:p>
-            <w:proofErr w:type="spellStart"/>
             <w:r>
               <w:rPr>
                 <w:b/>
                 <w:i/>
               </w:rPr>
-              <w:t>Acto</w:t>
-            </w:r>
-            <w:proofErr w:type="spellEnd"/>
+              <w:t xml:space="preserve">Acto </w:t>
+            </w:r>
             <w:r>
               <w:rPr>
                 <w:b/>
                 <w:i/>
               </w:rPr>
-              <w:t xml:space="preserve"> </w:t>
-            </w:r>
-            <w:r>
-              <w:rPr>
-                <w:b/>
-                <w:i/>
-              </w:rPr>
               <w:t>Segundo</w:t>
             </w:r>
           </w:p>
@@ -1213,11 +1099,9 @@
             <w:tcW w:w="2841" w:type="dxa"/>
           </w:tcPr>
           <w:p>
-            <w:proofErr w:type="spellStart"/>
             <w:r>
               <w:t>quintillas</w:t>
             </w:r>
-            <w:proofErr w:type="spellEnd"/>
           </w:p>
         </w:tc>
         <w:tc>
@@ -1238,6 +1122,7 @@
           </w:tcPr>
           <w:p>
             <w:r>
+              <w:lastRenderedPageBreak/>
               <w:t>79-110</w:t>
             </w:r>
           </w:p>
@@ -1247,11 +1132,9 @@
             <w:tcW w:w="2841" w:type="dxa"/>
           </w:tcPr>
           <w:p>
-            <w:proofErr w:type="spellStart"/>
             <w:r>
               <w:t>Redondillas</w:t>
             </w:r>
-            <w:proofErr w:type="spellEnd"/>
           </w:p>
         </w:tc>
         <w:tc>
@@ -1322,7 +1205,6 @@
                 <w:iCs/>
                 <w:lang w:eastAsia="it-IT"/>
               </w:rPr>
-              <w:lastRenderedPageBreak/>
               <w:t>Total</w:t>
             </w:r>
           </w:p>
@@ -1377,27 +1259,18 @@
             <w:tcW w:w="2841" w:type="dxa"/>
           </w:tcPr>
           <w:p>
-            <w:proofErr w:type="spellStart"/>
             <w:r>
               <w:rPr>
                 <w:b/>
                 <w:i/>
               </w:rPr>
-              <w:t>Acto</w:t>
-            </w:r>
-            <w:proofErr w:type="spellEnd"/>
+              <w:t xml:space="preserve">Acto </w:t>
+            </w:r>
             <w:r>
               <w:rPr>
                 <w:b/>
                 <w:i/>
               </w:rPr>
-              <w:t xml:space="preserve"> </w:t>
-            </w:r>
-            <w:r>
-              <w:rPr>
-                <w:b/>
-                <w:i/>
-              </w:rPr>
               <w:t>Tercero</w:t>
             </w:r>
           </w:p>
@@ -1431,11 +1304,9 @@
             <w:tcW w:w="2841" w:type="dxa"/>
           </w:tcPr>
           <w:p>
-            <w:proofErr w:type="spellStart"/>
             <w:r>
               <w:t>redondillas</w:t>
             </w:r>
-            <w:proofErr w:type="spellEnd"/>
           </w:p>
         </w:tc>
         <w:tc>
@@ -1465,13 +1336,8 @@
             <w:tcW w:w="2841" w:type="dxa"/>
           </w:tcPr>
           <w:p>
-            <w:proofErr w:type="spellStart"/>
-            <w:r>
-              <w:t>octavas</w:t>
-            </w:r>
-            <w:proofErr w:type="spellEnd"/>
-            <w:r>
-              <w:t xml:space="preserve"> reales</w:t>
+            <w:r>
+              <w:t>octavas reales</w:t>
             </w:r>
           </w:p>
         </w:tc>
@@ -1508,19 +1374,9 @@
             <w:tcW w:w="2841" w:type="dxa"/>
           </w:tcPr>
           <w:p>
-            <w:proofErr w:type="spellStart"/>
-            <w:r>
-              <w:t>tercetos</w:t>
-            </w:r>
-            <w:proofErr w:type="spellEnd"/>
-            <w:r>
-              <w:t xml:space="preserve"> </w:t>
-            </w:r>
-            <w:proofErr w:type="spellStart"/>
-            <w:r>
-              <w:t>encadenados</w:t>
-            </w:r>
-            <w:proofErr w:type="spellEnd"/>
+            <w:r>
+              <w:t>tercetos encadenados</w:t>
+            </w:r>
           </w:p>
         </w:tc>
         <w:tc>
@@ -1619,7 +1475,6 @@
                 <w:i/>
               </w:rPr>
             </w:pPr>
-            <w:proofErr w:type="spellStart"/>
             <w:r>
               <w:rPr>
                 <w:b/>
@@ -1627,7 +1482,6 @@
               </w:rPr>
               <w:t>Resumen</w:t>
             </w:r>
-            <w:proofErr w:type="spellEnd"/>
           </w:p>
         </w:tc>
         <w:tc>
@@ -1677,14 +1531,12 @@
             <w:tcW w:w="2841" w:type="dxa"/>
           </w:tcPr>
           <w:p>
-            <w:proofErr w:type="spellStart"/>
             <w:r>
               <w:t>r</w:t>
             </w:r>
             <w:r>
               <w:t>edondillas</w:t>
             </w:r>
-            <w:proofErr w:type="spellEnd"/>
           </w:p>
         </w:tc>
         <w:tc>
@@ -1714,11 +1566,9 @@
             <w:tcW w:w="2841" w:type="dxa"/>
           </w:tcPr>
           <w:p>
-            <w:proofErr w:type="spellStart"/>
             <w:r>
               <w:t>quintillas</w:t>
             </w:r>
-            <w:proofErr w:type="spellEnd"/>
           </w:p>
         </w:tc>
         <w:tc>
@@ -1780,19 +1630,9 @@
             <w:tcW w:w="2841" w:type="dxa"/>
           </w:tcPr>
           <w:p>
-            <w:proofErr w:type="spellStart"/>
-            <w:r>
-              <w:t>endecasílabos</w:t>
-            </w:r>
-            <w:proofErr w:type="spellEnd"/>
-            <w:r>
-              <w:t xml:space="preserve"> </w:t>
-            </w:r>
-            <w:proofErr w:type="spellStart"/>
-            <w:r>
-              <w:t>sueltos</w:t>
-            </w:r>
-            <w:proofErr w:type="spellEnd"/>
+            <w:r>
+              <w:t>endecasílabos sueltos</w:t>
+            </w:r>
           </w:p>
         </w:tc>
         <w:tc>
@@ -1822,13 +1662,8 @@
             <w:tcW w:w="2841" w:type="dxa"/>
           </w:tcPr>
           <w:p>
-            <w:proofErr w:type="spellStart"/>
-            <w:r>
-              <w:t>octavas</w:t>
-            </w:r>
-            <w:proofErr w:type="spellEnd"/>
-            <w:r>
-              <w:t xml:space="preserve"> reales</w:t>
+            <w:r>
+              <w:t>octavas reales</w:t>
             </w:r>
           </w:p>
         </w:tc>
@@ -1859,19 +1694,9 @@
             <w:tcW w:w="2841" w:type="dxa"/>
           </w:tcPr>
           <w:p>
-            <w:proofErr w:type="spellStart"/>
-            <w:r>
-              <w:t>tercetos</w:t>
-            </w:r>
-            <w:proofErr w:type="spellEnd"/>
-            <w:r>
-              <w:t xml:space="preserve"> </w:t>
-            </w:r>
-            <w:proofErr w:type="spellStart"/>
-            <w:r>
-              <w:t>encadenados</w:t>
-            </w:r>
-            <w:proofErr w:type="spellEnd"/>
+            <w:r>
+              <w:t>tercetos encadenados</w:t>
+            </w:r>
           </w:p>
         </w:tc>
         <w:tc>
@@ -1933,11 +1758,9 @@
             <w:tcW w:w="2841" w:type="dxa"/>
           </w:tcPr>
           <w:p>
-            <w:proofErr w:type="spellStart"/>
             <w:r>
               <w:t>soneto</w:t>
             </w:r>
-            <w:proofErr w:type="spellEnd"/>
           </w:p>
         </w:tc>
         <w:tc>
@@ -2222,34 +2045,10 @@
         <w:t xml:space="preserve"> explicativas o entradas de aparato crítico</w:t>
       </w:r>
       <w:r>
-        <w:t xml:space="preserve">, ahora no van como notas al pie, sino que están en un archivo aparte. Dado que no se pueden usar números como en los versos, para las notas en las partes sin numerar (títulos, dedicatoria, </w:t>
-      </w:r>
-      <w:proofErr w:type="spellStart"/>
-      <w:r>
-        <w:t>dramatis</w:t>
-      </w:r>
-      <w:proofErr w:type="spellEnd"/>
-      <w:r>
-        <w:t xml:space="preserve"> </w:t>
-      </w:r>
-      <w:proofErr w:type="spellStart"/>
-      <w:r>
-        <w:t>personae</w:t>
-      </w:r>
-      <w:proofErr w:type="spellEnd"/>
-      <w:r>
-        <w:t>, acotaciones, etc.), se usa @ delante la @palabra a la que afecta, o última palabra de la frase, de forma que se identifique después dónde va la llamada a la nota.</w:t>
-      </w:r>
-      <w:r>
-        <w:t xml:space="preserve"> Si se trata de una entrada de aparato crítico, </w:t>
-      </w:r>
-      <w:proofErr w:type="gramStart"/>
-      <w:r>
-        <w:t>igual</w:t>
-      </w:r>
-      <w:proofErr w:type="gramEnd"/>
-      <w:r>
-        <w:t xml:space="preserve"> pero con %. Si una @%palabra lleva una nota y también una entrada de aparato, se usan ambos símbolos en ese orden.</w:t>
+        <w:t>, ahora no van como notas al pie, sino que están en un archivo aparte. Dado que no se pueden usar números como en los versos, para las notas en las partes sin numerar (títulos, dedicatoria, dramatis personae, acotaciones, etc.), se usa @ delante la @palabra a la que afecta, o última palabra de la frase, de forma que se identifique después dónde va la llamada a la nota.</w:t>
+      </w:r>
+      <w:r>
+        <w:t xml:space="preserve"> Si se trata de una entrada de aparato crítico, igual pero con %. Si una @%palabra lleva una nota y también una entrada de aparato, se usan ambos símbolos en ese orden.</w:t>
       </w:r>
     </w:p>
     <w:p>
@@ -2272,6 +2071,7 @@
         <w:pStyle w:val="EpigrDramatis"/>
       </w:pPr>
       <w:r>
+        <w:lastRenderedPageBreak/>
         <w:t>Personas</w:t>
       </w:r>
       <w:r>
@@ -2303,7 +2103,6 @@
         <w:pStyle w:val="Dramatislista"/>
       </w:pPr>
       <w:r>
-        <w:lastRenderedPageBreak/>
         <w:t>PERSONAJE2</w:t>
       </w:r>
     </w:p>
@@ -2730,35 +2529,35 @@
         <w:pStyle w:val="Personaje"/>
       </w:pPr>
       <w:r>
-        <w:t>P</w:t>
-      </w:r>
-      <w:r>
-        <w:t>ersonaje</w:t>
-      </w:r>
-      <w:r>
-        <w:t>4</w:t>
-      </w:r>
-    </w:p>
-    <w:p>
-      <w:pPr>
-        <w:pStyle w:val="Partidoinicial"/>
-      </w:pPr>
-      <w:r>
-        <w:t>Primero</w:t>
-      </w:r>
-      <w:r>
-        <w:t xml:space="preserve"> </w:t>
-      </w:r>
-    </w:p>
-    <w:p>
-      <w:pPr>
-        <w:pStyle w:val="Personaje"/>
-      </w:pPr>
-      <w:r>
         <w:lastRenderedPageBreak/>
         <w:t>P</w:t>
       </w:r>
       <w:r>
+        <w:t>ersonaje</w:t>
+      </w:r>
+      <w:r>
+        <w:t>4</w:t>
+      </w:r>
+    </w:p>
+    <w:p>
+      <w:pPr>
+        <w:pStyle w:val="Partidoinicial"/>
+      </w:pPr>
+      <w:r>
+        <w:t>Primero</w:t>
+      </w:r>
+      <w:r>
+        <w:t xml:space="preserve"> </w:t>
+      </w:r>
+    </w:p>
+    <w:p>
+      <w:pPr>
+        <w:pStyle w:val="Personaje"/>
+      </w:pPr>
+      <w:r>
+        <w:t>P</w:t>
+      </w:r>
+      <w:r>
         <w:t>ersonaje3</w:t>
       </w:r>
     </w:p>
@@ -2832,13 +2631,8 @@
       <w:pPr>
         <w:pStyle w:val="Partidofinal"/>
       </w:pPr>
-      <w:proofErr w:type="spellStart"/>
-      <w:r>
-        <w:t>si</w:t>
-      </w:r>
-      <w:proofErr w:type="spellEnd"/>
-      <w:r>
-        <w:t xml:space="preserve"> hay unión,  </w:t>
+      <w:r>
+        <w:t xml:space="preserve">si hay unión,  </w:t>
       </w:r>
     </w:p>
     <w:p>
@@ -3118,6 +2912,7 @@
         <w:pStyle w:val="Verso"/>
       </w:pPr>
       <w:r>
+        <w:lastRenderedPageBreak/>
         <w:t>que no hay cómputo contado</w:t>
       </w:r>
       <w:r>
@@ -3137,7 +2932,6 @@
         <w:pStyle w:val="Personaje"/>
       </w:pPr>
       <w:r>
-        <w:lastRenderedPageBreak/>
         <w:t>P</w:t>
       </w:r>
       <w:r>

</xml_diff>

<commit_message>
añadido soporte de hipervínculos
</commit_message>
<xml_diff>
--- a/test/test_prologoycomedia.docx
+++ b/test/test_prologoycomedia.docx
@@ -129,7 +129,35 @@
         <w:rPr>
           <w:lang w:val="es-ES"/>
         </w:rPr>
-        <w:t>hi rend="italic"</w:t>
+        <w:t xml:space="preserve">hi </w:t>
+      </w:r>
+      <w:proofErr w:type="spellStart"/>
+      <w:r>
+        <w:rPr>
+          <w:lang w:val="es-ES"/>
+        </w:rPr>
+        <w:t>rend</w:t>
+      </w:r>
+      <w:proofErr w:type="spellEnd"/>
+      <w:r>
+        <w:rPr>
+          <w:lang w:val="es-ES"/>
+        </w:rPr>
+        <w:t>="</w:t>
+      </w:r>
+      <w:proofErr w:type="spellStart"/>
+      <w:r>
+        <w:rPr>
+          <w:lang w:val="es-ES"/>
+        </w:rPr>
+        <w:t>italic</w:t>
+      </w:r>
+      <w:proofErr w:type="spellEnd"/>
+      <w:r>
+        <w:rPr>
+          <w:lang w:val="es-ES"/>
+        </w:rPr>
+        <w:t>"</w:t>
       </w:r>
       <w:r>
         <w:rPr>
@@ -344,6 +372,54 @@
           <w:lang w:val="es-ES"/>
         </w:rPr>
         <w:t>Acotación en el prólogo</w:t>
+      </w:r>
+    </w:p>
+    <w:p>
+      <w:pPr>
+        <w:rPr>
+          <w:lang w:val="es-ES"/>
+        </w:rPr>
+      </w:pPr>
+      <w:r>
+        <w:rPr>
+          <w:lang w:val="es-ES"/>
+        </w:rPr>
+        <w:t xml:space="preserve">También puedes usar </w:t>
+      </w:r>
+      <w:hyperlink r:id="rId7" w:history="1">
+        <w:r>
+          <w:rPr>
+            <w:rStyle w:val="Hipervnculo"/>
+            <w:lang w:val="es-ES"/>
+          </w:rPr>
+          <w:t>enlaces</w:t>
+        </w:r>
+      </w:hyperlink>
+      <w:r>
+        <w:rPr>
+          <w:lang w:val="es-ES"/>
+        </w:rPr>
+        <w:t>, c</w:t>
+      </w:r>
+      <w:r>
+        <w:rPr>
+          <w:lang w:val="es-ES"/>
+        </w:rPr>
+        <w:t xml:space="preserve">omo </w:t>
+      </w:r>
+      <w:proofErr w:type="spellStart"/>
+      <w:r>
+        <w:rPr>
+          <w:lang w:val="es-ES"/>
+        </w:rPr>
+        <w:t>hipervículos</w:t>
+      </w:r>
+      <w:proofErr w:type="spellEnd"/>
+      <w:r>
+        <w:rPr>
+          <w:lang w:val="es-ES"/>
+        </w:rPr>
+        <w:t>.</w:t>
       </w:r>
     </w:p>
     <w:p>
@@ -389,8 +465,13 @@
             <w:tcW w:w="3209" w:type="dxa"/>
           </w:tcPr>
           <w:p>
-            <w:r>
-              <w:t>Número de verso</w:t>
+            <w:proofErr w:type="spellStart"/>
+            <w:r>
+              <w:t>Número</w:t>
+            </w:r>
+            <w:proofErr w:type="spellEnd"/>
+            <w:r>
+              <w:t xml:space="preserve"> de verso</w:t>
             </w:r>
           </w:p>
         </w:tc>
@@ -405,33 +486,43 @@
                 <w:iCs/>
               </w:rPr>
             </w:pPr>
+            <w:proofErr w:type="spellStart"/>
             <w:r>
               <w:rPr>
                 <w:i/>
                 <w:iCs/>
                 <w:lang w:val="pt-PT"/>
               </w:rPr>
-              <w:t>Penn A2A5B1</w:t>
-            </w:r>
-          </w:p>
-        </w:tc>
-        <w:tc>
-          <w:tcPr>
-            <w:tcW w:w="3210" w:type="dxa"/>
-          </w:tcPr>
-          <w:p>
-            <w:pPr>
-              <w:rPr>
-                <w:i/>
-                <w:iCs/>
-              </w:rPr>
-            </w:pPr>
+              <w:t>Penn</w:t>
+            </w:r>
+            <w:proofErr w:type="spellEnd"/>
             <w:r>
               <w:rPr>
                 <w:i/>
                 <w:iCs/>
                 <w:lang w:val="pt-PT"/>
               </w:rPr>
+              <w:t xml:space="preserve"> A2A5B1</w:t>
+            </w:r>
+          </w:p>
+        </w:tc>
+        <w:tc>
+          <w:tcPr>
+            <w:tcW w:w="3210" w:type="dxa"/>
+          </w:tcPr>
+          <w:p>
+            <w:pPr>
+              <w:rPr>
+                <w:i/>
+                <w:iCs/>
+              </w:rPr>
+            </w:pPr>
+            <w:r>
+              <w:rPr>
+                <w:i/>
+                <w:iCs/>
+                <w:lang w:val="pt-PT"/>
+              </w:rPr>
               <w:t>A1A3A4</w:t>
             </w:r>
           </w:p>
@@ -469,11 +560,19 @@
             <w:tcW w:w="3210" w:type="dxa"/>
           </w:tcPr>
           <w:p>
+            <w:proofErr w:type="spellStart"/>
             <w:r>
               <w:rPr>
                 <w:lang w:val="pt-PT"/>
               </w:rPr>
-              <w:t>orque [errata]</w:t>
+              <w:t>orque</w:t>
+            </w:r>
+            <w:proofErr w:type="spellEnd"/>
+            <w:r>
+              <w:rPr>
+                <w:lang w:val="pt-PT"/>
+              </w:rPr>
+              <w:t xml:space="preserve"> [errata]</w:t>
             </w:r>
           </w:p>
         </w:tc>
@@ -497,11 +596,19 @@
             <w:tcW w:w="3209" w:type="dxa"/>
           </w:tcPr>
           <w:p>
+            <w:proofErr w:type="spellStart"/>
             <w:r>
               <w:rPr>
                 <w:lang w:val="es-ES"/>
               </w:rPr>
-              <w:t>aua [errata]</w:t>
+              <w:t>aua</w:t>
+            </w:r>
+            <w:proofErr w:type="spellEnd"/>
+            <w:r>
+              <w:rPr>
+                <w:lang w:val="es-ES"/>
+              </w:rPr>
+              <w:t xml:space="preserve"> [errata]</w:t>
             </w:r>
           </w:p>
         </w:tc>
@@ -510,12 +617,14 @@
             <w:tcW w:w="3210" w:type="dxa"/>
           </w:tcPr>
           <w:p>
+            <w:proofErr w:type="spellStart"/>
             <w:r>
               <w:rPr>
                 <w:lang w:val="es-ES"/>
               </w:rPr>
               <w:t>auia</w:t>
             </w:r>
+            <w:proofErr w:type="spellEnd"/>
           </w:p>
         </w:tc>
       </w:tr>
@@ -538,11 +647,19 @@
             <w:tcW w:w="3209" w:type="dxa"/>
           </w:tcPr>
           <w:p>
+            <w:proofErr w:type="spellStart"/>
             <w:r>
               <w:rPr>
                 <w:lang w:val="es-ES"/>
               </w:rPr>
-              <w:t>om [errata]</w:t>
+              <w:t>om</w:t>
+            </w:r>
+            <w:proofErr w:type="spellEnd"/>
+            <w:r>
+              <w:rPr>
+                <w:lang w:val="es-ES"/>
+              </w:rPr>
+              <w:t xml:space="preserve"> [errata]</w:t>
             </w:r>
           </w:p>
         </w:tc>
@@ -579,11 +696,19 @@
             <w:tcW w:w="3209" w:type="dxa"/>
           </w:tcPr>
           <w:p>
+            <w:proofErr w:type="spellStart"/>
             <w:r>
               <w:rPr>
                 <w:lang w:val="es-ES"/>
               </w:rPr>
-              <w:t>Esteuan es</w:t>
+              <w:t>Esteuan</w:t>
+            </w:r>
+            <w:proofErr w:type="spellEnd"/>
+            <w:r>
+              <w:rPr>
+                <w:lang w:val="es-ES"/>
+              </w:rPr>
+              <w:t xml:space="preserve"> es</w:t>
             </w:r>
           </w:p>
         </w:tc>
@@ -592,12 +717,14 @@
             <w:tcW w:w="3210" w:type="dxa"/>
           </w:tcPr>
           <w:p>
+            <w:proofErr w:type="spellStart"/>
             <w:r>
               <w:rPr>
                 <w:lang w:val="es-ES"/>
               </w:rPr>
               <w:t>Esteuañez</w:t>
             </w:r>
+            <w:proofErr w:type="spellEnd"/>
           </w:p>
         </w:tc>
       </w:tr>
@@ -633,12 +760,14 @@
             <w:tcW w:w="3210" w:type="dxa"/>
           </w:tcPr>
           <w:p>
+            <w:proofErr w:type="spellStart"/>
             <w:r>
               <w:rPr>
                 <w:lang w:val="es-ES"/>
               </w:rPr>
               <w:t>huuo</w:t>
             </w:r>
+            <w:proofErr w:type="spellEnd"/>
           </w:p>
         </w:tc>
       </w:tr>
@@ -768,6 +897,7 @@
                 <w:lang w:eastAsia="it-IT"/>
               </w:rPr>
             </w:pPr>
+            <w:proofErr w:type="spellStart"/>
             <w:r>
               <w:rPr>
                 <w:rFonts w:ascii="Arial" w:eastAsia="Times New Roman" w:hAnsi="Arial" w:cs="Arial"/>
@@ -779,6 +909,7 @@
               </w:rPr>
               <w:t>Estrofa</w:t>
             </w:r>
+            <w:proofErr w:type="spellEnd"/>
           </w:p>
         </w:tc>
         <w:tc>
@@ -817,12 +948,21 @@
             <w:tcW w:w="2841" w:type="dxa"/>
           </w:tcPr>
           <w:p>
+            <w:proofErr w:type="spellStart"/>
             <w:r>
               <w:rPr>
                 <w:b/>
                 <w:i/>
               </w:rPr>
-              <w:t>Acto primero</w:t>
+              <w:t>Acto</w:t>
+            </w:r>
+            <w:proofErr w:type="spellEnd"/>
+            <w:r>
+              <w:rPr>
+                <w:b/>
+                <w:i/>
+              </w:rPr>
+              <w:t xml:space="preserve"> primero</w:t>
             </w:r>
           </w:p>
         </w:tc>
@@ -860,9 +1000,11 @@
             <w:tcW w:w="2841" w:type="dxa"/>
           </w:tcPr>
           <w:p>
+            <w:proofErr w:type="spellStart"/>
             <w:r>
               <w:t>redondillas</w:t>
             </w:r>
+            <w:proofErr w:type="spellEnd"/>
           </w:p>
         </w:tc>
         <w:tc>
@@ -896,8 +1038,21 @@
           </w:tcPr>
           <w:p>
             <w:r>
-              <w:t>romance en – eo</w:t>
-            </w:r>
+              <w:t xml:space="preserve">romance </w:t>
+            </w:r>
+            <w:proofErr w:type="spellStart"/>
+            <w:r>
+              <w:t>en</w:t>
+            </w:r>
+            <w:proofErr w:type="spellEnd"/>
+            <w:r>
+              <w:t xml:space="preserve"> – </w:t>
+            </w:r>
+            <w:proofErr w:type="spellStart"/>
+            <w:r>
+              <w:t>eo</w:t>
+            </w:r>
+            <w:proofErr w:type="spellEnd"/>
           </w:p>
         </w:tc>
         <w:tc>
@@ -927,9 +1082,19 @@
             <w:tcW w:w="2841" w:type="dxa"/>
           </w:tcPr>
           <w:p>
-            <w:r>
-              <w:t>endecasílabos sueltos</w:t>
-            </w:r>
+            <w:proofErr w:type="spellStart"/>
+            <w:r>
+              <w:t>endecasílabos</w:t>
+            </w:r>
+            <w:proofErr w:type="spellEnd"/>
+            <w:r>
+              <w:t xml:space="preserve"> </w:t>
+            </w:r>
+            <w:proofErr w:type="spellStart"/>
+            <w:r>
+              <w:t>sueltos</w:t>
+            </w:r>
+            <w:proofErr w:type="spellEnd"/>
           </w:p>
         </w:tc>
         <w:tc>
@@ -959,9 +1124,11 @@
             <w:tcW w:w="2841" w:type="dxa"/>
           </w:tcPr>
           <w:p>
+            <w:proofErr w:type="spellStart"/>
             <w:r>
               <w:t>soneto</w:t>
             </w:r>
+            <w:proofErr w:type="spellEnd"/>
           </w:p>
         </w:tc>
         <w:tc>
@@ -1054,18 +1221,27 @@
             <w:tcW w:w="2841" w:type="dxa"/>
           </w:tcPr>
           <w:p>
+            <w:proofErr w:type="spellStart"/>
             <w:r>
               <w:rPr>
                 <w:b/>
                 <w:i/>
               </w:rPr>
-              <w:t xml:space="preserve">Acto </w:t>
-            </w:r>
+              <w:t>Acto</w:t>
+            </w:r>
+            <w:proofErr w:type="spellEnd"/>
             <w:r>
               <w:rPr>
                 <w:b/>
                 <w:i/>
               </w:rPr>
+              <w:t xml:space="preserve"> </w:t>
+            </w:r>
+            <w:r>
+              <w:rPr>
+                <w:b/>
+                <w:i/>
+              </w:rPr>
               <w:t>Segundo</w:t>
             </w:r>
           </w:p>
@@ -1090,6 +1266,7 @@
           </w:tcPr>
           <w:p>
             <w:r>
+              <w:lastRenderedPageBreak/>
               <w:t>59-78</w:t>
             </w:r>
           </w:p>
@@ -1099,9 +1276,11 @@
             <w:tcW w:w="2841" w:type="dxa"/>
           </w:tcPr>
           <w:p>
+            <w:proofErr w:type="spellStart"/>
             <w:r>
               <w:t>quintillas</w:t>
             </w:r>
+            <w:proofErr w:type="spellEnd"/>
           </w:p>
         </w:tc>
         <w:tc>
@@ -1122,7 +1301,6 @@
           </w:tcPr>
           <w:p>
             <w:r>
-              <w:lastRenderedPageBreak/>
               <w:t>79-110</w:t>
             </w:r>
           </w:p>
@@ -1132,9 +1310,11 @@
             <w:tcW w:w="2841" w:type="dxa"/>
           </w:tcPr>
           <w:p>
+            <w:proofErr w:type="spellStart"/>
             <w:r>
               <w:t>Redondillas</w:t>
             </w:r>
+            <w:proofErr w:type="spellEnd"/>
           </w:p>
         </w:tc>
         <w:tc>
@@ -1259,18 +1439,27 @@
             <w:tcW w:w="2841" w:type="dxa"/>
           </w:tcPr>
           <w:p>
+            <w:proofErr w:type="spellStart"/>
             <w:r>
               <w:rPr>
                 <w:b/>
                 <w:i/>
               </w:rPr>
-              <w:t xml:space="preserve">Acto </w:t>
-            </w:r>
+              <w:t>Acto</w:t>
+            </w:r>
+            <w:proofErr w:type="spellEnd"/>
             <w:r>
               <w:rPr>
                 <w:b/>
                 <w:i/>
               </w:rPr>
+              <w:t xml:space="preserve"> </w:t>
+            </w:r>
+            <w:r>
+              <w:rPr>
+                <w:b/>
+                <w:i/>
+              </w:rPr>
               <w:t>Tercero</w:t>
             </w:r>
           </w:p>
@@ -1304,9 +1493,11 @@
             <w:tcW w:w="2841" w:type="dxa"/>
           </w:tcPr>
           <w:p>
+            <w:proofErr w:type="spellStart"/>
             <w:r>
               <w:t>redondillas</w:t>
             </w:r>
+            <w:proofErr w:type="spellEnd"/>
           </w:p>
         </w:tc>
         <w:tc>
@@ -1336,8 +1527,13 @@
             <w:tcW w:w="2841" w:type="dxa"/>
           </w:tcPr>
           <w:p>
-            <w:r>
-              <w:t>octavas reales</w:t>
+            <w:proofErr w:type="spellStart"/>
+            <w:r>
+              <w:t>octavas</w:t>
+            </w:r>
+            <w:proofErr w:type="spellEnd"/>
+            <w:r>
+              <w:t xml:space="preserve"> reales</w:t>
             </w:r>
           </w:p>
         </w:tc>
@@ -1374,9 +1570,19 @@
             <w:tcW w:w="2841" w:type="dxa"/>
           </w:tcPr>
           <w:p>
-            <w:r>
-              <w:t>tercetos encadenados</w:t>
-            </w:r>
+            <w:proofErr w:type="spellStart"/>
+            <w:r>
+              <w:t>tercetos</w:t>
+            </w:r>
+            <w:proofErr w:type="spellEnd"/>
+            <w:r>
+              <w:t xml:space="preserve"> </w:t>
+            </w:r>
+            <w:proofErr w:type="spellStart"/>
+            <w:r>
+              <w:t>encadenados</w:t>
+            </w:r>
+            <w:proofErr w:type="spellEnd"/>
           </w:p>
         </w:tc>
         <w:tc>
@@ -1475,6 +1681,7 @@
                 <w:i/>
               </w:rPr>
             </w:pPr>
+            <w:proofErr w:type="spellStart"/>
             <w:r>
               <w:rPr>
                 <w:b/>
@@ -1482,6 +1689,7 @@
               </w:rPr>
               <w:t>Resumen</w:t>
             </w:r>
+            <w:proofErr w:type="spellEnd"/>
           </w:p>
         </w:tc>
         <w:tc>
@@ -1531,12 +1739,14 @@
             <w:tcW w:w="2841" w:type="dxa"/>
           </w:tcPr>
           <w:p>
+            <w:proofErr w:type="spellStart"/>
             <w:r>
               <w:t>r</w:t>
             </w:r>
             <w:r>
               <w:t>edondillas</w:t>
             </w:r>
+            <w:proofErr w:type="spellEnd"/>
           </w:p>
         </w:tc>
         <w:tc>
@@ -1566,9 +1776,11 @@
             <w:tcW w:w="2841" w:type="dxa"/>
           </w:tcPr>
           <w:p>
+            <w:proofErr w:type="spellStart"/>
             <w:r>
               <w:t>quintillas</w:t>
             </w:r>
+            <w:proofErr w:type="spellEnd"/>
           </w:p>
         </w:tc>
         <w:tc>
@@ -1630,9 +1842,19 @@
             <w:tcW w:w="2841" w:type="dxa"/>
           </w:tcPr>
           <w:p>
-            <w:r>
-              <w:t>endecasílabos sueltos</w:t>
-            </w:r>
+            <w:proofErr w:type="spellStart"/>
+            <w:r>
+              <w:t>endecasílabos</w:t>
+            </w:r>
+            <w:proofErr w:type="spellEnd"/>
+            <w:r>
+              <w:t xml:space="preserve"> </w:t>
+            </w:r>
+            <w:proofErr w:type="spellStart"/>
+            <w:r>
+              <w:t>sueltos</w:t>
+            </w:r>
+            <w:proofErr w:type="spellEnd"/>
           </w:p>
         </w:tc>
         <w:tc>
@@ -1662,8 +1884,13 @@
             <w:tcW w:w="2841" w:type="dxa"/>
           </w:tcPr>
           <w:p>
-            <w:r>
-              <w:t>octavas reales</w:t>
+            <w:proofErr w:type="spellStart"/>
+            <w:r>
+              <w:t>octavas</w:t>
+            </w:r>
+            <w:proofErr w:type="spellEnd"/>
+            <w:r>
+              <w:t xml:space="preserve"> reales</w:t>
             </w:r>
           </w:p>
         </w:tc>
@@ -1694,9 +1921,19 @@
             <w:tcW w:w="2841" w:type="dxa"/>
           </w:tcPr>
           <w:p>
-            <w:r>
-              <w:t>tercetos encadenados</w:t>
-            </w:r>
+            <w:proofErr w:type="spellStart"/>
+            <w:r>
+              <w:t>tercetos</w:t>
+            </w:r>
+            <w:proofErr w:type="spellEnd"/>
+            <w:r>
+              <w:t xml:space="preserve"> </w:t>
+            </w:r>
+            <w:proofErr w:type="spellStart"/>
+            <w:r>
+              <w:t>encadenados</w:t>
+            </w:r>
+            <w:proofErr w:type="spellEnd"/>
           </w:p>
         </w:tc>
         <w:tc>
@@ -1758,9 +1995,11 @@
             <w:tcW w:w="2841" w:type="dxa"/>
           </w:tcPr>
           <w:p>
+            <w:proofErr w:type="spellStart"/>
             <w:r>
               <w:t>soneto</w:t>
             </w:r>
+            <w:proofErr w:type="spellEnd"/>
           </w:p>
         </w:tc>
         <w:tc>
@@ -2045,10 +2284,34 @@
         <w:t xml:space="preserve"> explicativas o entradas de aparato crítico</w:t>
       </w:r>
       <w:r>
-        <w:t>, ahora no van como notas al pie, sino que están en un archivo aparte. Dado que no se pueden usar números como en los versos, para las notas en las partes sin numerar (títulos, dedicatoria, dramatis personae, acotaciones, etc.), se usa @ delante la @palabra a la que afecta, o última palabra de la frase, de forma que se identifique después dónde va la llamada a la nota.</w:t>
-      </w:r>
-      <w:r>
-        <w:t xml:space="preserve"> Si se trata de una entrada de aparato crítico, igual pero con %. Si una @%palabra lleva una nota y también una entrada de aparato, se usan ambos símbolos en ese orden.</w:t>
+        <w:t xml:space="preserve">, ahora no van como notas al pie, sino que están en un archivo aparte. Dado que no se pueden usar números como en los versos, para las notas en las partes sin numerar (títulos, dedicatoria, </w:t>
+      </w:r>
+      <w:proofErr w:type="spellStart"/>
+      <w:r>
+        <w:t>dramatis</w:t>
+      </w:r>
+      <w:proofErr w:type="spellEnd"/>
+      <w:r>
+        <w:t xml:space="preserve"> </w:t>
+      </w:r>
+      <w:proofErr w:type="spellStart"/>
+      <w:r>
+        <w:t>personae</w:t>
+      </w:r>
+      <w:proofErr w:type="spellEnd"/>
+      <w:r>
+        <w:t>, acotaciones, etc.), se usa @ delante la @palabra a la que afecta, o última palabra de la frase, de forma que se identifique después dónde va la llamada a la nota.</w:t>
+      </w:r>
+      <w:r>
+        <w:t xml:space="preserve"> Si se trata de una entrada de aparato crítico, </w:t>
+      </w:r>
+      <w:proofErr w:type="gramStart"/>
+      <w:r>
+        <w:t>igual</w:t>
+      </w:r>
+      <w:proofErr w:type="gramEnd"/>
+      <w:r>
+        <w:t xml:space="preserve"> pero con %. Si una @%palabra lleva una nota y también una entrada de aparato, se usan ambos símbolos en ese orden.</w:t>
       </w:r>
     </w:p>
     <w:p>
@@ -2631,8 +2894,13 @@
       <w:pPr>
         <w:pStyle w:val="Partidofinal"/>
       </w:pPr>
-      <w:r>
-        <w:t xml:space="preserve">si hay unión,  </w:t>
+      <w:proofErr w:type="spellStart"/>
+      <w:r>
+        <w:t>si</w:t>
+      </w:r>
+      <w:proofErr w:type="spellEnd"/>
+      <w:r>
+        <w:t xml:space="preserve"> hay unión,  </w:t>
       </w:r>
     </w:p>
     <w:p>
@@ -4601,6 +4869,29 @@
       <w:lang w:val="es-ES"/>
     </w:rPr>
   </w:style>
+  <w:style w:type="character" w:styleId="Hipervnculo">
+    <w:name w:val="Hyperlink"/>
+    <w:basedOn w:val="Fuentedeprrafopredeter"/>
+    <w:uiPriority w:val="99"/>
+    <w:unhideWhenUsed/>
+    <w:rsid w:val="00E973FC"/>
+    <w:rPr>
+      <w:color w:val="467886" w:themeColor="hyperlink"/>
+      <w:u w:val="single"/>
+    </w:rPr>
+  </w:style>
+  <w:style w:type="character" w:styleId="Mencinsinresolver">
+    <w:name w:val="Unresolved Mention"/>
+    <w:basedOn w:val="Fuentedeprrafopredeter"/>
+    <w:uiPriority w:val="99"/>
+    <w:semiHidden/>
+    <w:unhideWhenUsed/>
+    <w:rsid w:val="00E973FC"/>
+    <w:rPr>
+      <w:color w:val="605E5C"/>
+      <w:shd w:val="clear" w:color="auto" w:fill="E1DFDD"/>
+    </w:rPr>
+  </w:style>
 </w:styles>
 </file>
 

</xml_diff>

<commit_message>
mejoras en el procesamiento de tablas, separación de responsabilidades tablas simples/versificación; guardado en memoria de la última validación; filtrado de avisos de validación para facilitar la revisión
</commit_message>
<xml_diff>
--- a/test/test_prologoycomedia.docx
+++ b/test/test_prologoycomedia.docx
@@ -129,35 +129,7 @@
         <w:rPr>
           <w:lang w:val="es-ES"/>
         </w:rPr>
-        <w:t xml:space="preserve">hi </w:t>
-      </w:r>
-      <w:proofErr w:type="spellStart"/>
-      <w:r>
-        <w:rPr>
-          <w:lang w:val="es-ES"/>
-        </w:rPr>
-        <w:t>rend</w:t>
-      </w:r>
-      <w:proofErr w:type="spellEnd"/>
-      <w:r>
-        <w:rPr>
-          <w:lang w:val="es-ES"/>
-        </w:rPr>
-        <w:t>="</w:t>
-      </w:r>
-      <w:proofErr w:type="spellStart"/>
-      <w:r>
-        <w:rPr>
-          <w:lang w:val="es-ES"/>
-        </w:rPr>
-        <w:t>italic</w:t>
-      </w:r>
-      <w:proofErr w:type="spellEnd"/>
-      <w:r>
-        <w:rPr>
-          <w:lang w:val="es-ES"/>
-        </w:rPr>
-        <w:t>"</w:t>
+        <w:t>hi rend="italic"</w:t>
       </w:r>
       <w:r>
         <w:rPr>
@@ -373,6 +345,13 @@
         </w:rPr>
         <w:t>Acotación en el prólogo</w:t>
       </w:r>
+    </w:p>
+    <w:p>
+      <w:pPr>
+        <w:rPr>
+          <w:lang w:val="es-ES"/>
+        </w:rPr>
+      </w:pPr>
     </w:p>
     <w:p>
       <w:pPr>
@@ -399,22 +378,26 @@
         <w:rPr>
           <w:lang w:val="es-ES"/>
         </w:rPr>
-        <w:t>, c</w:t>
-      </w:r>
-      <w:r>
-        <w:rPr>
-          <w:lang w:val="es-ES"/>
-        </w:rPr>
-        <w:t xml:space="preserve">omo </w:t>
-      </w:r>
-      <w:proofErr w:type="spellStart"/>
-      <w:r>
-        <w:rPr>
-          <w:lang w:val="es-ES"/>
-        </w:rPr>
-        <w:t>hipervículos</w:t>
-      </w:r>
-      <w:proofErr w:type="spellEnd"/>
+        <w:t xml:space="preserve">, </w:t>
+      </w:r>
+      <w:r>
+        <w:rPr>
+          <w:lang w:val="es-ES"/>
+        </w:rPr>
+        <w:t>usando la función</w:t>
+      </w:r>
+      <w:r>
+        <w:rPr>
+          <w:lang w:val="es-ES"/>
+        </w:rPr>
+        <w:t xml:space="preserve"> </w:t>
+      </w:r>
+      <w:r>
+        <w:rPr>
+          <w:lang w:val="es-ES"/>
+        </w:rPr>
+        <w:t>del hipervínculo</w:t>
+      </w:r>
       <w:r>
         <w:rPr>
           <w:lang w:val="es-ES"/>
@@ -465,13 +448,11 @@
             <w:tcW w:w="3209" w:type="dxa"/>
           </w:tcPr>
           <w:p>
-            <w:proofErr w:type="spellStart"/>
-            <w:r>
-              <w:t>Número</w:t>
-            </w:r>
-            <w:proofErr w:type="spellEnd"/>
-            <w:r>
-              <w:t xml:space="preserve"> de verso</w:t>
+            <w:r>
+              <w:t>^</w:t>
+            </w:r>
+            <w:r>
+              <w:t>Número de verso</w:t>
             </w:r>
           </w:p>
         </w:tc>
@@ -486,43 +467,45 @@
                 <w:iCs/>
               </w:rPr>
             </w:pPr>
-            <w:proofErr w:type="spellStart"/>
+            <w:r>
+              <w:rPr>
+                <w:lang w:val="pt-PT"/>
+              </w:rPr>
+              <w:t xml:space="preserve">^ </w:t>
+            </w:r>
             <w:r>
               <w:rPr>
                 <w:i/>
                 <w:iCs/>
                 <w:lang w:val="pt-PT"/>
               </w:rPr>
-              <w:t>Penn</w:t>
-            </w:r>
-            <w:proofErr w:type="spellEnd"/>
+              <w:t>Penn A2A5B1</w:t>
+            </w:r>
+          </w:p>
+        </w:tc>
+        <w:tc>
+          <w:tcPr>
+            <w:tcW w:w="3210" w:type="dxa"/>
+          </w:tcPr>
+          <w:p>
+            <w:pPr>
+              <w:rPr>
+                <w:i/>
+                <w:iCs/>
+              </w:rPr>
+            </w:pPr>
+            <w:r>
+              <w:rPr>
+                <w:lang w:val="pt-PT"/>
+              </w:rPr>
+              <w:t xml:space="preserve">^ </w:t>
+            </w:r>
             <w:r>
               <w:rPr>
                 <w:i/>
                 <w:iCs/>
                 <w:lang w:val="pt-PT"/>
               </w:rPr>
-              <w:t xml:space="preserve"> A2A5B1</w:t>
-            </w:r>
-          </w:p>
-        </w:tc>
-        <w:tc>
-          <w:tcPr>
-            <w:tcW w:w="3210" w:type="dxa"/>
-          </w:tcPr>
-          <w:p>
-            <w:pPr>
-              <w:rPr>
-                <w:i/>
-                <w:iCs/>
-              </w:rPr>
-            </w:pPr>
-            <w:r>
-              <w:rPr>
-                <w:i/>
-                <w:iCs/>
-                <w:lang w:val="pt-PT"/>
-              </w:rPr>
               <w:t>A1A3A4</w:t>
             </w:r>
           </w:p>
@@ -560,19 +543,11 @@
             <w:tcW w:w="3210" w:type="dxa"/>
           </w:tcPr>
           <w:p>
-            <w:proofErr w:type="spellStart"/>
             <w:r>
               <w:rPr>
                 <w:lang w:val="pt-PT"/>
               </w:rPr>
-              <w:t>orque</w:t>
-            </w:r>
-            <w:proofErr w:type="spellEnd"/>
-            <w:r>
-              <w:rPr>
-                <w:lang w:val="pt-PT"/>
-              </w:rPr>
-              <w:t xml:space="preserve"> [errata]</w:t>
+              <w:t>orque [errata]</w:t>
             </w:r>
           </w:p>
         </w:tc>
@@ -596,35 +571,25 @@
             <w:tcW w:w="3209" w:type="dxa"/>
           </w:tcPr>
           <w:p>
-            <w:proofErr w:type="spellStart"/>
             <w:r>
               <w:rPr>
                 <w:lang w:val="es-ES"/>
               </w:rPr>
-              <w:t>aua</w:t>
-            </w:r>
-            <w:proofErr w:type="spellEnd"/>
+              <w:t>aua [errata]</w:t>
+            </w:r>
+          </w:p>
+        </w:tc>
+        <w:tc>
+          <w:tcPr>
+            <w:tcW w:w="3210" w:type="dxa"/>
+          </w:tcPr>
+          <w:p>
             <w:r>
               <w:rPr>
                 <w:lang w:val="es-ES"/>
               </w:rPr>
-              <w:t xml:space="preserve"> [errata]</w:t>
-            </w:r>
-          </w:p>
-        </w:tc>
-        <w:tc>
-          <w:tcPr>
-            <w:tcW w:w="3210" w:type="dxa"/>
-          </w:tcPr>
-          <w:p>
-            <w:proofErr w:type="spellStart"/>
-            <w:r>
-              <w:rPr>
-                <w:lang w:val="es-ES"/>
-              </w:rPr>
               <w:t>auia</w:t>
             </w:r>
-            <w:proofErr w:type="spellEnd"/>
           </w:p>
         </w:tc>
       </w:tr>
@@ -647,19 +612,11 @@
             <w:tcW w:w="3209" w:type="dxa"/>
           </w:tcPr>
           <w:p>
-            <w:proofErr w:type="spellStart"/>
             <w:r>
               <w:rPr>
                 <w:lang w:val="es-ES"/>
               </w:rPr>
-              <w:t>om</w:t>
-            </w:r>
-            <w:proofErr w:type="spellEnd"/>
-            <w:r>
-              <w:rPr>
-                <w:lang w:val="es-ES"/>
-              </w:rPr>
-              <w:t xml:space="preserve"> [errata]</w:t>
+              <w:t>om [errata]</w:t>
             </w:r>
           </w:p>
         </w:tc>
@@ -696,35 +653,25 @@
             <w:tcW w:w="3209" w:type="dxa"/>
           </w:tcPr>
           <w:p>
-            <w:proofErr w:type="spellStart"/>
             <w:r>
               <w:rPr>
                 <w:lang w:val="es-ES"/>
               </w:rPr>
-              <w:t>Esteuan</w:t>
-            </w:r>
-            <w:proofErr w:type="spellEnd"/>
+              <w:t>Esteuan es</w:t>
+            </w:r>
+          </w:p>
+        </w:tc>
+        <w:tc>
+          <w:tcPr>
+            <w:tcW w:w="3210" w:type="dxa"/>
+          </w:tcPr>
+          <w:p>
             <w:r>
               <w:rPr>
                 <w:lang w:val="es-ES"/>
               </w:rPr>
-              <w:t xml:space="preserve"> es</w:t>
-            </w:r>
-          </w:p>
-        </w:tc>
-        <w:tc>
-          <w:tcPr>
-            <w:tcW w:w="3210" w:type="dxa"/>
-          </w:tcPr>
-          <w:p>
-            <w:proofErr w:type="spellStart"/>
-            <w:r>
-              <w:rPr>
-                <w:lang w:val="es-ES"/>
-              </w:rPr>
               <w:t>Esteuañez</w:t>
             </w:r>
-            <w:proofErr w:type="spellEnd"/>
           </w:p>
         </w:tc>
       </w:tr>
@@ -760,14 +707,12 @@
             <w:tcW w:w="3210" w:type="dxa"/>
           </w:tcPr>
           <w:p>
-            <w:proofErr w:type="spellStart"/>
             <w:r>
               <w:rPr>
                 <w:lang w:val="es-ES"/>
               </w:rPr>
               <w:t>huuo</w:t>
             </w:r>
-            <w:proofErr w:type="spellEnd"/>
           </w:p>
         </w:tc>
       </w:tr>
@@ -778,6 +723,46 @@
           <w:lang w:val="es-ES"/>
         </w:rPr>
       </w:pPr>
+    </w:p>
+    <w:p>
+      <w:pPr>
+        <w:rPr>
+          <w:lang w:val="es-ES"/>
+        </w:rPr>
+      </w:pPr>
+      <w:r>
+        <w:rPr>
+          <w:lang w:val="es-ES"/>
+        </w:rPr>
+        <w:t xml:space="preserve">Usa el símbolo ^ delante de las celdas que deban formar el encabezado de tabla. Asegúrate de que no está en </w:t>
+      </w:r>
+      <w:r>
+        <w:rPr>
+          <w:i/>
+          <w:iCs/>
+          <w:lang w:val="es-ES"/>
+        </w:rPr>
+        <w:t>cursiva</w:t>
+      </w:r>
+      <w:r>
+        <w:rPr>
+          <w:lang w:val="es-ES"/>
+        </w:rPr>
+        <w:t xml:space="preserve"> y de que ninguna celda del encabezado está vacía</w:t>
+      </w:r>
+      <w:r>
+        <w:rPr>
+          <w:lang w:val="es-ES"/>
+        </w:rPr>
+        <w:t>.</w:t>
+      </w:r>
+      <w:r>
+        <w:rPr>
+          <w:rStyle w:val="Refdenotaalpie"/>
+          <w:lang w:val="es-ES"/>
+        </w:rPr>
+        <w:footnoteReference w:id="3"/>
+      </w:r>
     </w:p>
     <w:p>
       <w:pPr>
@@ -877,6 +862,7 @@
                 <w:iCs/>
                 <w:lang w:eastAsia="it-IT"/>
               </w:rPr>
+              <w:lastRenderedPageBreak/>
               <w:t>Versos</w:t>
             </w:r>
           </w:p>
@@ -897,7 +883,6 @@
                 <w:lang w:eastAsia="it-IT"/>
               </w:rPr>
             </w:pPr>
-            <w:proofErr w:type="spellStart"/>
             <w:r>
               <w:rPr>
                 <w:rFonts w:ascii="Arial" w:eastAsia="Times New Roman" w:hAnsi="Arial" w:cs="Arial"/>
@@ -909,7 +894,6 @@
               </w:rPr>
               <w:t>Estrofa</w:t>
             </w:r>
-            <w:proofErr w:type="spellEnd"/>
           </w:p>
         </w:tc>
         <w:tc>
@@ -948,21 +932,12 @@
             <w:tcW w:w="2841" w:type="dxa"/>
           </w:tcPr>
           <w:p>
-            <w:proofErr w:type="spellStart"/>
             <w:r>
               <w:rPr>
                 <w:b/>
                 <w:i/>
               </w:rPr>
-              <w:t>Acto</w:t>
-            </w:r>
-            <w:proofErr w:type="spellEnd"/>
-            <w:r>
-              <w:rPr>
-                <w:b/>
-                <w:i/>
-              </w:rPr>
-              <w:t xml:space="preserve"> primero</w:t>
+              <w:t>Acto primero</w:t>
             </w:r>
           </w:p>
         </w:tc>
@@ -1000,11 +975,9 @@
             <w:tcW w:w="2841" w:type="dxa"/>
           </w:tcPr>
           <w:p>
-            <w:proofErr w:type="spellStart"/>
             <w:r>
               <w:t>redondillas</w:t>
             </w:r>
-            <w:proofErr w:type="spellEnd"/>
           </w:p>
         </w:tc>
         <w:tc>
@@ -1038,21 +1011,8 @@
           </w:tcPr>
           <w:p>
             <w:r>
-              <w:t xml:space="preserve">romance </w:t>
-            </w:r>
-            <w:proofErr w:type="spellStart"/>
-            <w:r>
-              <w:t>en</w:t>
-            </w:r>
-            <w:proofErr w:type="spellEnd"/>
-            <w:r>
-              <w:t xml:space="preserve"> – </w:t>
-            </w:r>
-            <w:proofErr w:type="spellStart"/>
-            <w:r>
-              <w:t>eo</w:t>
-            </w:r>
-            <w:proofErr w:type="spellEnd"/>
+              <w:t>romance en – eo</w:t>
+            </w:r>
           </w:p>
         </w:tc>
         <w:tc>
@@ -1082,19 +1042,9 @@
             <w:tcW w:w="2841" w:type="dxa"/>
           </w:tcPr>
           <w:p>
-            <w:proofErr w:type="spellStart"/>
-            <w:r>
-              <w:t>endecasílabos</w:t>
-            </w:r>
-            <w:proofErr w:type="spellEnd"/>
-            <w:r>
-              <w:t xml:space="preserve"> </w:t>
-            </w:r>
-            <w:proofErr w:type="spellStart"/>
-            <w:r>
-              <w:t>sueltos</w:t>
-            </w:r>
-            <w:proofErr w:type="spellEnd"/>
+            <w:r>
+              <w:t>endecasílabos sueltos</w:t>
+            </w:r>
           </w:p>
         </w:tc>
         <w:tc>
@@ -1124,11 +1074,9 @@
             <w:tcW w:w="2841" w:type="dxa"/>
           </w:tcPr>
           <w:p>
-            <w:proofErr w:type="spellStart"/>
             <w:r>
               <w:t>soneto</w:t>
             </w:r>
-            <w:proofErr w:type="spellEnd"/>
           </w:p>
         </w:tc>
         <w:tc>
@@ -1221,27 +1169,18 @@
             <w:tcW w:w="2841" w:type="dxa"/>
           </w:tcPr>
           <w:p>
-            <w:proofErr w:type="spellStart"/>
             <w:r>
               <w:rPr>
                 <w:b/>
                 <w:i/>
               </w:rPr>
-              <w:t>Acto</w:t>
-            </w:r>
-            <w:proofErr w:type="spellEnd"/>
+              <w:t xml:space="preserve">Acto </w:t>
+            </w:r>
             <w:r>
               <w:rPr>
                 <w:b/>
                 <w:i/>
               </w:rPr>
-              <w:t xml:space="preserve"> </w:t>
-            </w:r>
-            <w:r>
-              <w:rPr>
-                <w:b/>
-                <w:i/>
-              </w:rPr>
               <w:t>Segundo</w:t>
             </w:r>
           </w:p>
@@ -1266,7 +1205,6 @@
           </w:tcPr>
           <w:p>
             <w:r>
-              <w:lastRenderedPageBreak/>
               <w:t>59-78</w:t>
             </w:r>
           </w:p>
@@ -1276,11 +1214,9 @@
             <w:tcW w:w="2841" w:type="dxa"/>
           </w:tcPr>
           <w:p>
-            <w:proofErr w:type="spellStart"/>
             <w:r>
               <w:t>quintillas</w:t>
             </w:r>
-            <w:proofErr w:type="spellEnd"/>
           </w:p>
         </w:tc>
         <w:tc>
@@ -1310,11 +1246,9 @@
             <w:tcW w:w="2841" w:type="dxa"/>
           </w:tcPr>
           <w:p>
-            <w:proofErr w:type="spellStart"/>
             <w:r>
               <w:t>Redondillas</w:t>
             </w:r>
-            <w:proofErr w:type="spellEnd"/>
           </w:p>
         </w:tc>
         <w:tc>
@@ -1439,27 +1373,18 @@
             <w:tcW w:w="2841" w:type="dxa"/>
           </w:tcPr>
           <w:p>
-            <w:proofErr w:type="spellStart"/>
             <w:r>
               <w:rPr>
                 <w:b/>
                 <w:i/>
               </w:rPr>
-              <w:t>Acto</w:t>
-            </w:r>
-            <w:proofErr w:type="spellEnd"/>
+              <w:t xml:space="preserve">Acto </w:t>
+            </w:r>
             <w:r>
               <w:rPr>
                 <w:b/>
                 <w:i/>
               </w:rPr>
-              <w:t xml:space="preserve"> </w:t>
-            </w:r>
-            <w:r>
-              <w:rPr>
-                <w:b/>
-                <w:i/>
-              </w:rPr>
               <w:t>Tercero</w:t>
             </w:r>
           </w:p>
@@ -1493,11 +1418,9 @@
             <w:tcW w:w="2841" w:type="dxa"/>
           </w:tcPr>
           <w:p>
-            <w:proofErr w:type="spellStart"/>
             <w:r>
               <w:t>redondillas</w:t>
             </w:r>
-            <w:proofErr w:type="spellEnd"/>
           </w:p>
         </w:tc>
         <w:tc>
@@ -1527,13 +1450,8 @@
             <w:tcW w:w="2841" w:type="dxa"/>
           </w:tcPr>
           <w:p>
-            <w:proofErr w:type="spellStart"/>
-            <w:r>
-              <w:t>octavas</w:t>
-            </w:r>
-            <w:proofErr w:type="spellEnd"/>
-            <w:r>
-              <w:t xml:space="preserve"> reales</w:t>
+            <w:r>
+              <w:t>octavas reales</w:t>
             </w:r>
           </w:p>
         </w:tc>
@@ -1549,7 +1467,7 @@
               <w:rPr>
                 <w:rStyle w:val="Refdenotaalpie"/>
               </w:rPr>
-              <w:footnoteReference w:id="3"/>
+              <w:footnoteReference w:id="4"/>
             </w:r>
           </w:p>
         </w:tc>
@@ -1570,19 +1488,9 @@
             <w:tcW w:w="2841" w:type="dxa"/>
           </w:tcPr>
           <w:p>
-            <w:proofErr w:type="spellStart"/>
-            <w:r>
-              <w:t>tercetos</w:t>
-            </w:r>
-            <w:proofErr w:type="spellEnd"/>
-            <w:r>
-              <w:t xml:space="preserve"> </w:t>
-            </w:r>
-            <w:proofErr w:type="spellStart"/>
-            <w:r>
-              <w:t>encadenados</w:t>
-            </w:r>
-            <w:proofErr w:type="spellEnd"/>
+            <w:r>
+              <w:t>tercetos encadenados</w:t>
+            </w:r>
           </w:p>
         </w:tc>
         <w:tc>
@@ -1681,7 +1589,6 @@
                 <w:i/>
               </w:rPr>
             </w:pPr>
-            <w:proofErr w:type="spellStart"/>
             <w:r>
               <w:rPr>
                 <w:b/>
@@ -1689,7 +1596,6 @@
               </w:rPr>
               <w:t>Resumen</w:t>
             </w:r>
-            <w:proofErr w:type="spellEnd"/>
           </w:p>
         </w:tc>
         <w:tc>
@@ -1739,14 +1645,12 @@
             <w:tcW w:w="2841" w:type="dxa"/>
           </w:tcPr>
           <w:p>
-            <w:proofErr w:type="spellStart"/>
             <w:r>
               <w:t>r</w:t>
             </w:r>
             <w:r>
               <w:t>edondillas</w:t>
             </w:r>
-            <w:proofErr w:type="spellEnd"/>
           </w:p>
         </w:tc>
         <w:tc>
@@ -1776,11 +1680,9 @@
             <w:tcW w:w="2841" w:type="dxa"/>
           </w:tcPr>
           <w:p>
-            <w:proofErr w:type="spellStart"/>
             <w:r>
               <w:t>quintillas</w:t>
             </w:r>
-            <w:proofErr w:type="spellEnd"/>
           </w:p>
         </w:tc>
         <w:tc>
@@ -1842,19 +1744,9 @@
             <w:tcW w:w="2841" w:type="dxa"/>
           </w:tcPr>
           <w:p>
-            <w:proofErr w:type="spellStart"/>
-            <w:r>
-              <w:t>endecasílabos</w:t>
-            </w:r>
-            <w:proofErr w:type="spellEnd"/>
-            <w:r>
-              <w:t xml:space="preserve"> </w:t>
-            </w:r>
-            <w:proofErr w:type="spellStart"/>
-            <w:r>
-              <w:t>sueltos</w:t>
-            </w:r>
-            <w:proofErr w:type="spellEnd"/>
+            <w:r>
+              <w:t>endecasílabos sueltos</w:t>
+            </w:r>
           </w:p>
         </w:tc>
         <w:tc>
@@ -1884,13 +1776,8 @@
             <w:tcW w:w="2841" w:type="dxa"/>
           </w:tcPr>
           <w:p>
-            <w:proofErr w:type="spellStart"/>
-            <w:r>
-              <w:t>octavas</w:t>
-            </w:r>
-            <w:proofErr w:type="spellEnd"/>
-            <w:r>
-              <w:t xml:space="preserve"> reales</w:t>
+            <w:r>
+              <w:t>octavas reales</w:t>
             </w:r>
           </w:p>
         </w:tc>
@@ -1921,19 +1808,9 @@
             <w:tcW w:w="2841" w:type="dxa"/>
           </w:tcPr>
           <w:p>
-            <w:proofErr w:type="spellStart"/>
-            <w:r>
-              <w:t>tercetos</w:t>
-            </w:r>
-            <w:proofErr w:type="spellEnd"/>
-            <w:r>
-              <w:t xml:space="preserve"> </w:t>
-            </w:r>
-            <w:proofErr w:type="spellStart"/>
-            <w:r>
-              <w:t>encadenados</w:t>
-            </w:r>
-            <w:proofErr w:type="spellEnd"/>
+            <w:r>
+              <w:t>tercetos encadenados</w:t>
+            </w:r>
           </w:p>
         </w:tc>
         <w:tc>
@@ -1995,11 +1872,9 @@
             <w:tcW w:w="2841" w:type="dxa"/>
           </w:tcPr>
           <w:p>
-            <w:proofErr w:type="spellStart"/>
             <w:r>
               <w:t>soneto</w:t>
             </w:r>
-            <w:proofErr w:type="spellEnd"/>
           </w:p>
         </w:tc>
         <w:tc>
@@ -2284,34 +2159,14 @@
         <w:t xml:space="preserve"> explicativas o entradas de aparato crítico</w:t>
       </w:r>
       <w:r>
-        <w:t xml:space="preserve">, ahora no van como notas al pie, sino que están en un archivo aparte. Dado que no se pueden usar números como en los versos, para las notas en las partes sin numerar (títulos, dedicatoria, </w:t>
-      </w:r>
-      <w:proofErr w:type="spellStart"/>
-      <w:r>
-        <w:t>dramatis</w:t>
-      </w:r>
-      <w:proofErr w:type="spellEnd"/>
-      <w:r>
-        <w:t xml:space="preserve"> </w:t>
-      </w:r>
-      <w:proofErr w:type="spellStart"/>
-      <w:r>
-        <w:t>personae</w:t>
-      </w:r>
-      <w:proofErr w:type="spellEnd"/>
-      <w:r>
-        <w:t>, acotaciones, etc.), se usa @ delante la @palabra a la que afecta, o última palabra de la frase, de forma que se identifique después dónde va la llamada a la nota.</w:t>
-      </w:r>
-      <w:r>
-        <w:t xml:space="preserve"> Si se trata de una entrada de aparato crítico, </w:t>
-      </w:r>
-      <w:proofErr w:type="gramStart"/>
-      <w:r>
-        <w:t>igual</w:t>
-      </w:r>
-      <w:proofErr w:type="gramEnd"/>
-      <w:r>
-        <w:t xml:space="preserve"> pero con %. Si una @%palabra lleva una nota y también una entrada de aparato, se usan ambos símbolos en ese orden.</w:t>
+        <w:t xml:space="preserve">, ahora no van como notas al pie, sino que están en un archivo aparte. Dado que no se pueden usar números como en los versos, para las notas en las partes </w:t>
+      </w:r>
+      <w:r>
+        <w:lastRenderedPageBreak/>
+        <w:t>sin numerar (títulos, dedicatoria, dramatis personae, acotaciones, etc.), se usa @ delante la @palabra a la que afecta, o última palabra de la frase, de forma que se identifique después dónde va la llamada a la nota.</w:t>
+      </w:r>
+      <w:r>
+        <w:t xml:space="preserve"> Si se trata de una entrada de aparato crítico, igual pero con %. Si una @%palabra lleva una nota y también una entrada de aparato, se usan ambos símbolos en ese orden.</w:t>
       </w:r>
     </w:p>
     <w:p>
@@ -2334,7 +2189,6 @@
         <w:pStyle w:val="EpigrDramatis"/>
       </w:pPr>
       <w:r>
-        <w:lastRenderedPageBreak/>
         <w:t>Personas</w:t>
       </w:r>
       <w:r>
@@ -2746,52 +2600,6 @@
         <w:pStyle w:val="Personaje"/>
       </w:pPr>
       <w:r>
-        <w:t>P</w:t>
-      </w:r>
-      <w:r>
-        <w:t>ersonaje</w:t>
-      </w:r>
-      <w:r>
-        <w:t>3</w:t>
-      </w:r>
-    </w:p>
-    <w:p>
-      <w:pPr>
-        <w:pStyle w:val="Verso"/>
-      </w:pPr>
-      <w:r>
-        <w:t xml:space="preserve">Si un verso queda partido  </w:t>
-      </w:r>
-    </w:p>
-    <w:p>
-      <w:pPr>
-        <w:pStyle w:val="Verso"/>
-      </w:pPr>
-      <w:r>
-        <w:t xml:space="preserve">entre varios personajes,  </w:t>
-      </w:r>
-    </w:p>
-    <w:p>
-      <w:pPr>
-        <w:pStyle w:val="Verso"/>
-      </w:pPr>
-      <w:r>
-        <w:t xml:space="preserve">marcamos cada fragmento  </w:t>
-      </w:r>
-    </w:p>
-    <w:p>
-      <w:pPr>
-        <w:pStyle w:val="Verso"/>
-      </w:pPr>
-      <w:r>
-        <w:t>con el estilo que encaje.</w:t>
-      </w:r>
-    </w:p>
-    <w:p>
-      <w:pPr>
-        <w:pStyle w:val="Personaje"/>
-      </w:pPr>
-      <w:r>
         <w:lastRenderedPageBreak/>
         <w:t>P</w:t>
       </w:r>
@@ -2799,6 +2607,52 @@
         <w:t>ersonaje</w:t>
       </w:r>
       <w:r>
+        <w:t>3</w:t>
+      </w:r>
+    </w:p>
+    <w:p>
+      <w:pPr>
+        <w:pStyle w:val="Verso"/>
+      </w:pPr>
+      <w:r>
+        <w:t xml:space="preserve">Si un verso queda partido  </w:t>
+      </w:r>
+    </w:p>
+    <w:p>
+      <w:pPr>
+        <w:pStyle w:val="Verso"/>
+      </w:pPr>
+      <w:r>
+        <w:t xml:space="preserve">entre varios personajes,  </w:t>
+      </w:r>
+    </w:p>
+    <w:p>
+      <w:pPr>
+        <w:pStyle w:val="Verso"/>
+      </w:pPr>
+      <w:r>
+        <w:t xml:space="preserve">marcamos cada fragmento  </w:t>
+      </w:r>
+    </w:p>
+    <w:p>
+      <w:pPr>
+        <w:pStyle w:val="Verso"/>
+      </w:pPr>
+      <w:r>
+        <w:t>con el estilo que encaje.</w:t>
+      </w:r>
+    </w:p>
+    <w:p>
+      <w:pPr>
+        <w:pStyle w:val="Personaje"/>
+      </w:pPr>
+      <w:r>
+        <w:t>P</w:t>
+      </w:r>
+      <w:r>
+        <w:t>ersonaje</w:t>
+      </w:r>
+      <w:r>
         <w:t>4</w:t>
       </w:r>
     </w:p>
@@ -2894,13 +2748,8 @@
       <w:pPr>
         <w:pStyle w:val="Partidofinal"/>
       </w:pPr>
-      <w:proofErr w:type="spellStart"/>
-      <w:r>
-        <w:t>si</w:t>
-      </w:r>
-      <w:proofErr w:type="spellEnd"/>
-      <w:r>
-        <w:t xml:space="preserve"> hay unión,  </w:t>
+      <w:r>
+        <w:t xml:space="preserve">si hay unión,  </w:t>
       </w:r>
     </w:p>
     <w:p>
@@ -3122,6 +2971,7 @@
         <w:pStyle w:val="Verso"/>
       </w:pPr>
       <w:r>
+        <w:lastRenderedPageBreak/>
         <w:t xml:space="preserve">cartas, notas, o discursos,  </w:t>
       </w:r>
     </w:p>
@@ -3180,7 +3030,6 @@
         <w:pStyle w:val="Verso"/>
       </w:pPr>
       <w:r>
-        <w:lastRenderedPageBreak/>
         <w:t>que no hay cómputo contado</w:t>
       </w:r>
       <w:r>
@@ -3403,6 +3252,148 @@
     </w:p>
   </w:footnote>
   <w:footnote w:id="3">
+    <w:p>
+      <w:pPr>
+        <w:pStyle w:val="Textonotapie"/>
+      </w:pPr>
+      <w:r>
+        <w:rPr>
+          <w:rStyle w:val="Refdenotaalpie"/>
+        </w:rPr>
+        <w:footnoteRef/>
+      </w:r>
+      <w:r>
+        <w:t xml:space="preserve"> También puedes usar tablas en las notas:</w:t>
+      </w:r>
+    </w:p>
+    <w:tbl>
+      <w:tblPr>
+        <w:tblStyle w:val="Tablaconcuadrcula"/>
+        <w:tblW w:w="0" w:type="auto"/>
+        <w:tblLook w:val="04A0" w:firstRow="1" w:lastRow="0" w:firstColumn="1" w:lastColumn="0" w:noHBand="0" w:noVBand="1"/>
+      </w:tblPr>
+      <w:tblGrid>
+        <w:gridCol w:w="2407"/>
+        <w:gridCol w:w="2407"/>
+        <w:gridCol w:w="2407"/>
+        <w:gridCol w:w="2407"/>
+      </w:tblGrid>
+      <w:tr>
+        <w:tc>
+          <w:tcPr>
+            <w:tcW w:w="2407" w:type="dxa"/>
+          </w:tcPr>
+          <w:p>
+            <w:pPr>
+              <w:pStyle w:val="Textonotapie"/>
+            </w:pPr>
+            <w:r>
+              <w:t>Ejemplo</w:t>
+            </w:r>
+          </w:p>
+        </w:tc>
+        <w:tc>
+          <w:tcPr>
+            <w:tcW w:w="2407" w:type="dxa"/>
+          </w:tcPr>
+          <w:p>
+            <w:pPr>
+              <w:pStyle w:val="Textonotapie"/>
+            </w:pPr>
+            <w:r>
+              <w:t>Ejemplo</w:t>
+            </w:r>
+          </w:p>
+        </w:tc>
+        <w:tc>
+          <w:tcPr>
+            <w:tcW w:w="2407" w:type="dxa"/>
+          </w:tcPr>
+          <w:p>
+            <w:pPr>
+              <w:pStyle w:val="Textonotapie"/>
+            </w:pPr>
+            <w:r>
+              <w:t>Ejemplo</w:t>
+            </w:r>
+          </w:p>
+        </w:tc>
+        <w:tc>
+          <w:tcPr>
+            <w:tcW w:w="2407" w:type="dxa"/>
+          </w:tcPr>
+          <w:p>
+            <w:pPr>
+              <w:pStyle w:val="Textonotapie"/>
+            </w:pPr>
+            <w:r>
+              <w:t>Ejemplo</w:t>
+            </w:r>
+          </w:p>
+        </w:tc>
+      </w:tr>
+      <w:tr>
+        <w:tc>
+          <w:tcPr>
+            <w:tcW w:w="2407" w:type="dxa"/>
+          </w:tcPr>
+          <w:p>
+            <w:pPr>
+              <w:pStyle w:val="Textonotapie"/>
+            </w:pPr>
+            <w:r>
+              <w:t>Ejemplo</w:t>
+            </w:r>
+          </w:p>
+        </w:tc>
+        <w:tc>
+          <w:tcPr>
+            <w:tcW w:w="2407" w:type="dxa"/>
+          </w:tcPr>
+          <w:p>
+            <w:pPr>
+              <w:pStyle w:val="Textonotapie"/>
+            </w:pPr>
+            <w:r>
+              <w:t>Ejemplo</w:t>
+            </w:r>
+          </w:p>
+        </w:tc>
+        <w:tc>
+          <w:tcPr>
+            <w:tcW w:w="2407" w:type="dxa"/>
+          </w:tcPr>
+          <w:p>
+            <w:pPr>
+              <w:pStyle w:val="Textonotapie"/>
+            </w:pPr>
+            <w:r>
+              <w:t>Ejemplo</w:t>
+            </w:r>
+          </w:p>
+        </w:tc>
+        <w:tc>
+          <w:tcPr>
+            <w:tcW w:w="2407" w:type="dxa"/>
+          </w:tcPr>
+          <w:p>
+            <w:pPr>
+              <w:pStyle w:val="Textonotapie"/>
+            </w:pPr>
+            <w:r>
+              <w:t>Ejemplo</w:t>
+            </w:r>
+          </w:p>
+        </w:tc>
+      </w:tr>
+    </w:tbl>
+    <w:p>
+      <w:pPr>
+        <w:pStyle w:val="Textonotapie"/>
+      </w:pPr>
+    </w:p>
+  </w:footnote>
+  <w:footnote w:id="4">
     <w:p>
       <w:pPr>
         <w:pStyle w:val="Textonotapie"/>

</xml_diff>